<commit_message>
Tilføj automatisk databaseopsætning og opdater dokumentation
</commit_message>
<xml_diff>
--- a/docs/GUI-dokumentation-GoogleDocs.docx
+++ b/docs/GUI-dokumentation-GoogleDocs.docx
@@ -258,27 +258,29 @@
     </w:p>
     <w:p>
       <w:pPr>
-        <w:pStyle xmlns:w="http://schemas.openxmlformats.org/wordprocessingml/2006/main" w:val="Heading3"/>
-        <w:keepNext xmlns:w="http://schemas.openxmlformats.org/wordprocessingml/2006/main" w:val="0"/>
-        <w:keepLines xmlns:w="http://schemas.openxmlformats.org/wordprocessingml/2006/main" w:val="1"/>
-        <w:spacing xmlns:w="http://schemas.openxmlformats.org/wordprocessingml/2006/main" w:after="120"/>
-      </w:pPr>
-      <w:r>
-        <w:rPr>
-          <w:i xmlns:w="http://schemas.openxmlformats.org/wordprocessingml/2006/main" w:val="1"/>
-          <w:color xmlns:w="http://schemas.openxmlformats.org/wordprocessingml/2006/main" w:val="505050"/>
-          <w:sz xmlns:w="http://schemas.openxmlformats.org/wordprocessingml/2006/main" w:val="21"/>
+        <w:pStyle w:val="Heading3"/>
+        <w:keepNext w:val="0"/>
+        <w:keepLines w:val="1"/>
+        <w:spacing w:after="120" w:lineRule="auto"/>
+        <w:rPr/>
+      </w:pPr>
+      <w:r>
+        <w:rPr>
+          <w:i w:val="1"/>
+          <w:iCs w:val="1"/>
+          <w:color w:val="505050"/>
+          <w:sz w:val="21"/>
+          <w:szCs w:val="21"/>
+          <w:rtl w:val="0"/>
         </w:rPr>
         <w:t xml:space="preserve">I koden:</w:t>
-      </w:r>
-      <w:r>
-        <w:rPr>
-          <w:i xmlns:w="http://schemas.openxmlformats.org/wordprocessingml/2006/main" w:val="1"/>
-          <w:color xmlns:w="http://schemas.openxmlformats.org/wordprocessingml/2006/main" w:val="505050"/>
-          <w:sz xmlns:w="http://schemas.openxmlformats.org/wordprocessingml/2006/main" w:val="21"/>
-        </w:rPr>
-        <w:br/>
+        <w:br w:type="textWrapping"/>
         <w:t xml:space="preserve">Components/App.razor: &lt;Home @rendermode="InteractiveServer" /&gt;.</w:t>
+      </w:r>
+      <w:r>
+        <w:rPr>
+          <w:rtl w:val="0"/>
+        </w:rPr>
       </w:r>
     </w:p>
     <w:p>
@@ -322,7 +324,7 @@
     <w:p>
       <w:pPr>
         <w:keepLines w:val="1"/>
-        <w:spacing w:after="0"/>
+        <w:spacing w:after="0" w:lineRule="auto"/>
         <w:rPr/>
       </w:pPr>
       <w:r>
@@ -335,7 +337,7 @@
     <w:p>
       <w:pPr>
         <w:keepLines w:val="1"/>
-        <w:spacing w:after="0"/>
+        <w:spacing w:after="0" w:lineRule="auto"/>
         <w:rPr/>
       </w:pPr>
       <w:r>
@@ -359,146 +361,33 @@
     </w:p>
     <w:p>
       <w:pPr>
-        <w:pStyle xmlns:w="http://schemas.openxmlformats.org/wordprocessingml/2006/main" w:val="Heading3"/>
-        <w:keepNext xmlns:w="http://schemas.openxmlformats.org/wordprocessingml/2006/main" w:val="0"/>
-        <w:keepLines xmlns:w="http://schemas.openxmlformats.org/wordprocessingml/2006/main" w:val="1"/>
-        <w:spacing xmlns:w="http://schemas.openxmlformats.org/wordprocessingml/2006/main" w:after="120"/>
-      </w:pPr>
-      <w:r>
-        <w:rPr>
-          <w:i xmlns:w="http://schemas.openxmlformats.org/wordprocessingml/2006/main" w:val="1"/>
-          <w:color xmlns:w="http://schemas.openxmlformats.org/wordprocessingml/2006/main" w:val="505050"/>
-          <w:sz xmlns:w="http://schemas.openxmlformats.org/wordprocessingml/2006/main" w:val="21"/>
-        </w:rPr>
-        <w:t xml:space="preserve">I koden:</w:t>
-      </w:r>
-      <w:r>
-        <w:rPr>
-          <w:i xmlns:w="http://schemas.openxmlformats.org/wordprocessingml/2006/main" w:val="1"/>
-          <w:color xmlns:w="http://schemas.openxmlformats.org/wordprocessingml/2006/main" w:val="505050"/>
-          <w:sz xmlns:w="http://schemas.openxmlformats.org/wordprocessingml/2006/main" w:val="21"/>
-        </w:rPr>
-        <w:br/>
-        <w:t xml:space="preserve">Components/Pages/Home.razor: OnInitialized og selectedTable.</w:t>
-      </w:r>
-      <w:r>
-        <w:rPr>
-          <w:i xmlns:w="http://schemas.openxmlformats.org/wordprocessingml/2006/main" w:val="1"/>
-          <w:color xmlns:w="http://schemas.openxmlformats.org/wordprocessingml/2006/main" w:val="505050"/>
-          <w:sz xmlns:w="http://schemas.openxmlformats.org/wordprocessingml/2006/main" w:val="21"/>
-        </w:rPr>
-        <w:br/>
-        <w:t xml:space="preserve">Components/Pages/PartialView/DatabaseTable.razor: LoadTable.</w:t>
-      </w:r>
-      <w:r>
-        <w:rPr>
-          <w:i xmlns:w="http://schemas.openxmlformats.org/wordprocessingml/2006/main" w:val="1"/>
-          <w:color xmlns:w="http://schemas.openxmlformats.org/wordprocessingml/2006/main" w:val="505050"/>
-          <w:sz xmlns:w="http://schemas.openxmlformats.org/wordprocessingml/2006/main" w:val="21"/>
-        </w:rPr>
-        <w:br/>
-        <w:t xml:space="preserve">DBAccess/Repository.cs: GetTableNames og GetTable.</w:t>
-      </w:r>
-    </w:p>
-    <w:p>
-      <w:pPr>
+        <w:pStyle w:val="Heading3"/>
+        <w:keepNext w:val="0"/>
         <w:keepLines w:val="1"/>
         <w:spacing w:after="120" w:lineRule="auto"/>
+        <w:rPr/>
+      </w:pPr>
+      <w:r>
         <w:rPr>
           <w:i w:val="1"/>
           <w:iCs w:val="1"/>
           <w:color w:val="505050"/>
-        </w:rPr>
-      </w:pPr>
-      <w:r>
-        <w:rPr>
-          <w:rtl w:val="0"/>
-        </w:rPr>
-      </w:r>
-    </w:p>
-    <w:p>
-      <w:pPr>
-        <w:pStyle w:val="Heading2"/>
-        <w:spacing w:after="60" w:before="160" w:lineRule="auto"/>
-        <w:rPr>
-          <w:b w:val="1"/>
-          <w:bCs w:val="1"/>
-          <w:sz w:val="23"/>
-          <w:szCs w:val="23"/>
-        </w:rPr>
-      </w:pPr>
-      <w:r>
-        <w:rPr>
-          <w:b w:val="1"/>
-          <w:bCs w:val="1"/>
-          <w:sz w:val="23"/>
-          <w:szCs w:val="23"/>
-          <w:rtl w:val="0"/>
-        </w:rPr>
-        <w:t xml:space="preserve">1.3 - Hvordan hænger den delvise rendering sammen?</w:t>
-      </w:r>
-    </w:p>
-    <w:p>
-      <w:pPr>
-        <w:keepLines w:val="1"/>
-        <w:spacing w:after="0"/>
-        <w:rPr/>
-      </w:pPr>
-      <w:r>
-        <w:rPr>
-          <w:rtl w:val="0"/>
-        </w:rPr>
-        <w:t xml:space="preserve">@bind ændrer selectedTable, når brugeren vælger i dropdownen.</w:t>
-      </w:r>
-    </w:p>
-    <w:p>
-      <w:pPr>
-        <w:keepLines w:val="1"/>
-        <w:spacing w:after="0"/>
-        <w:rPr/>
-      </w:pPr>
-      <w:r>
-        <w:rPr>
-          <w:rtl w:val="0"/>
-        </w:rPr>
-        <w:t xml:space="preserve">Derefter renderer Blazor igen, og @key="selectedTable" får den gamle DatabaseTable erstattet af en ny.</w:t>
-      </w:r>
-    </w:p>
-    <w:p>
-      <w:pPr>
-        <w:keepLines w:val="1"/>
-        <w:rPr/>
-      </w:pPr>
-      <w:r>
-        <w:rPr>
-          <w:rtl w:val="0"/>
-        </w:rPr>
-        <w:t xml:space="preserve">Den nye komponent henter data og starter på side 1; hele websiden genindlæses ikke.</w:t>
-      </w:r>
-    </w:p>
-    <w:p>
-      <w:pPr>
-        <w:pStyle xmlns:w="http://schemas.openxmlformats.org/wordprocessingml/2006/main" w:val="Heading3"/>
-        <w:keepNext xmlns:w="http://schemas.openxmlformats.org/wordprocessingml/2006/main" w:val="0"/>
-        <w:keepLines xmlns:w="http://schemas.openxmlformats.org/wordprocessingml/2006/main" w:val="1"/>
-        <w:spacing xmlns:w="http://schemas.openxmlformats.org/wordprocessingml/2006/main" w:after="120"/>
-      </w:pPr>
-      <w:r>
-        <w:rPr>
-          <w:i xmlns:w="http://schemas.openxmlformats.org/wordprocessingml/2006/main" w:val="1"/>
-          <w:color xmlns:w="http://schemas.openxmlformats.org/wordprocessingml/2006/main" w:val="505050"/>
-          <w:sz xmlns:w="http://schemas.openxmlformats.org/wordprocessingml/2006/main" w:val="21"/>
+          <w:sz w:val="21"/>
+          <w:szCs w:val="21"/>
+          <w:rtl w:val="0"/>
         </w:rPr>
         <w:t xml:space="preserve">I koden:</w:t>
-      </w:r>
-      <w:r>
-        <w:rPr>
-          <w:i xmlns:w="http://schemas.openxmlformats.org/wordprocessingml/2006/main" w:val="1"/>
-          <w:color xmlns:w="http://schemas.openxmlformats.org/wordprocessingml/2006/main" w:val="505050"/>
-          <w:sz xmlns:w="http://schemas.openxmlformats.org/wordprocessingml/2006/main" w:val="21"/>
-        </w:rPr>
-        <w:br/>
-        <w:t xml:space="preserve">Components/Pages/Home.razor: &lt;DatabaseTable @key="selectedTable" … /&gt;.</w:t>
+        <w:br w:type="textWrapping"/>
+        <w:t xml:space="preserve">Components/Pages/Home.razor: OnInitialized og selectedTable.</w:t>
+        <w:br w:type="textWrapping"/>
+        <w:t xml:space="preserve">Components/Pages/PartialView/DatabaseTable.razor: LoadTable.</w:t>
+        <w:br w:type="textWrapping"/>
+        <w:t xml:space="preserve">DBAccess/Repository.cs: GetTableNames og GetTable.</w:t>
+      </w:r>
+      <w:r>
+        <w:rPr>
+          <w:rtl w:val="0"/>
+        </w:rPr>
       </w:r>
     </w:p>
     <w:p>
@@ -519,6 +408,109 @@
     </w:p>
     <w:p>
       <w:pPr>
+        <w:pStyle w:val="Heading2"/>
+        <w:spacing w:after="60" w:before="160" w:lineRule="auto"/>
+        <w:rPr>
+          <w:b w:val="1"/>
+          <w:bCs w:val="1"/>
+          <w:sz w:val="23"/>
+          <w:szCs w:val="23"/>
+        </w:rPr>
+      </w:pPr>
+      <w:r>
+        <w:rPr>
+          <w:b w:val="1"/>
+          <w:bCs w:val="1"/>
+          <w:sz w:val="23"/>
+          <w:szCs w:val="23"/>
+          <w:rtl w:val="0"/>
+        </w:rPr>
+        <w:t xml:space="preserve">1.3 - Hvordan hænger den delvise rendering sammen?</w:t>
+      </w:r>
+    </w:p>
+    <w:p>
+      <w:pPr>
+        <w:keepLines w:val="1"/>
+        <w:spacing w:after="0" w:lineRule="auto"/>
+        <w:rPr/>
+      </w:pPr>
+      <w:r>
+        <w:rPr>
+          <w:rtl w:val="0"/>
+        </w:rPr>
+        <w:t xml:space="preserve">@bind ændrer selectedTable, når brugeren vælger i dropdownen.</w:t>
+      </w:r>
+    </w:p>
+    <w:p>
+      <w:pPr>
+        <w:keepLines w:val="1"/>
+        <w:spacing w:after="0" w:lineRule="auto"/>
+        <w:rPr/>
+      </w:pPr>
+      <w:r>
+        <w:rPr>
+          <w:rtl w:val="0"/>
+        </w:rPr>
+        <w:t xml:space="preserve">Derefter renderer Blazor igen, og @key="selectedTable" får den gamle DatabaseTable erstattet af en ny.</w:t>
+      </w:r>
+    </w:p>
+    <w:p>
+      <w:pPr>
+        <w:keepLines w:val="1"/>
+        <w:rPr/>
+      </w:pPr>
+      <w:r>
+        <w:rPr>
+          <w:rtl w:val="0"/>
+        </w:rPr>
+        <w:t xml:space="preserve">Den nye komponent henter data og starter på side 1; hele websiden genindlæses ikke.</w:t>
+      </w:r>
+    </w:p>
+    <w:p>
+      <w:pPr>
+        <w:pStyle w:val="Heading3"/>
+        <w:keepNext w:val="0"/>
+        <w:keepLines w:val="1"/>
+        <w:spacing w:after="120" w:lineRule="auto"/>
+        <w:rPr/>
+      </w:pPr>
+      <w:r>
+        <w:rPr>
+          <w:i w:val="1"/>
+          <w:iCs w:val="1"/>
+          <w:color w:val="505050"/>
+          <w:sz w:val="21"/>
+          <w:szCs w:val="21"/>
+          <w:rtl w:val="0"/>
+        </w:rPr>
+        <w:t xml:space="preserve">I koden:</w:t>
+        <w:br w:type="textWrapping"/>
+        <w:t xml:space="preserve">Components/Pages/Home.razor: &lt;DatabaseTable @key="selectedTable" … /&gt;.</w:t>
+      </w:r>
+      <w:r>
+        <w:rPr>
+          <w:rtl w:val="0"/>
+        </w:rPr>
+      </w:r>
+    </w:p>
+    <w:p>
+      <w:pPr>
+        <w:keepLines w:val="1"/>
+        <w:spacing w:after="120" w:lineRule="auto"/>
+        <w:rPr>
+          <w:i w:val="1"/>
+          <w:iCs w:val="1"/>
+          <w:color w:val="505050"/>
+        </w:rPr>
+      </w:pPr>
+      <w:r>
+        <w:rPr>
+          <w:rtl w:val="0"/>
+        </w:rPr>
+      </w:r>
+    </w:p>
+    <w:p>
+      <w:pPr>
         <w:keepLines w:val="1"/>
         <w:shd w:fill="f2f2f2" w:val="clear"/>
         <w:rPr>
@@ -589,7 +581,7 @@
     <w:p>
       <w:pPr>
         <w:keepLines w:val="1"/>
-        <w:spacing w:after="0"/>
+        <w:spacing w:after="0" w:lineRule="auto"/>
         <w:rPr/>
       </w:pPr>
       <w:r>
@@ -613,46 +605,34 @@
     </w:p>
     <w:p>
       <w:pPr>
-        <w:pStyle xmlns:w="http://schemas.openxmlformats.org/wordprocessingml/2006/main" w:val="Heading3"/>
-        <w:keepNext xmlns:w="http://schemas.openxmlformats.org/wordprocessingml/2006/main" w:val="0"/>
-        <w:keepLines xmlns:w="http://schemas.openxmlformats.org/wordprocessingml/2006/main" w:val="1"/>
-        <w:spacing xmlns:w="http://schemas.openxmlformats.org/wordprocessingml/2006/main" w:after="120"/>
-      </w:pPr>
-      <w:r>
-        <w:rPr>
-          <w:i xmlns:w="http://schemas.openxmlformats.org/wordprocessingml/2006/main" w:val="1"/>
-          <w:color xmlns:w="http://schemas.openxmlformats.org/wordprocessingml/2006/main" w:val="505050"/>
-          <w:sz xmlns:w="http://schemas.openxmlformats.org/wordprocessingml/2006/main" w:val="21"/>
+        <w:pStyle w:val="Heading3"/>
+        <w:keepNext w:val="0"/>
+        <w:keepLines w:val="1"/>
+        <w:spacing w:after="120" w:lineRule="auto"/>
+        <w:rPr/>
+      </w:pPr>
+      <w:r>
+        <w:rPr>
+          <w:i w:val="1"/>
+          <w:iCs w:val="1"/>
+          <w:color w:val="505050"/>
+          <w:sz w:val="21"/>
+          <w:szCs w:val="21"/>
+          <w:rtl w:val="0"/>
         </w:rPr>
         <w:t xml:space="preserve">I koden:</w:t>
-      </w:r>
-      <w:r>
-        <w:rPr>
-          <w:i xmlns:w="http://schemas.openxmlformats.org/wordprocessingml/2006/main" w:val="1"/>
-          <w:color xmlns:w="http://schemas.openxmlformats.org/wordprocessingml/2006/main" w:val="505050"/>
-          <w:sz xmlns:w="http://schemas.openxmlformats.org/wordprocessingml/2006/main" w:val="21"/>
-        </w:rPr>
-        <w:br/>
+        <w:br w:type="textWrapping"/>
         <w:t xml:space="preserve">Components/Pages/Home.razor: header.</w:t>
-      </w:r>
-      <w:r>
-        <w:rPr>
-          <w:i xmlns:w="http://schemas.openxmlformats.org/wordprocessingml/2006/main" w:val="1"/>
-          <w:color xmlns:w="http://schemas.openxmlformats.org/wordprocessingml/2006/main" w:val="505050"/>
-          <w:sz xmlns:w="http://schemas.openxmlformats.org/wordprocessingml/2006/main" w:val="21"/>
-        </w:rPr>
-        <w:br/>
+        <w:br w:type="textWrapping"/>
         <w:t xml:space="preserve">Components/Pages/CustomControls/LanguageSelector.razor.</w:t>
-      </w:r>
-      <w:r>
-        <w:rPr>
-          <w:i xmlns:w="http://schemas.openxmlformats.org/wordprocessingml/2006/main" w:val="1"/>
-          <w:color xmlns:w="http://schemas.openxmlformats.org/wordprocessingml/2006/main" w:val="505050"/>
-          <w:sz xmlns:w="http://schemas.openxmlformats.org/wordprocessingml/2006/main" w:val="21"/>
-        </w:rPr>
-        <w:br/>
+        <w:br w:type="textWrapping"/>
         <w:t xml:space="preserve">wwwroot/images/language.svg.</w:t>
       </w:r>
+      <w:r>
+        <w:rPr>
+          <w:rtl w:val="0"/>
+        </w:rPr>
+      </w:r>
     </w:p>
     <w:p>
       <w:pPr>
@@ -661,8 +641,8 @@
         <w:spacing w:after="120" w:lineRule="auto"/>
         <w:rPr/>
       </w:pPr>
-      <w:bookmarkStart w:colFirst="0" w:colLast="0" w:name="_heading=h.apktboymqarc" w:id="4"/>
-      <w:bookmarkEnd w:id="4"/>
+      <w:bookmarkStart w:colFirst="0" w:colLast="0" w:name="_heading=h.apktboymqarc" w:id="1"/>
+      <w:bookmarkEnd w:id="1"/>
       <w:r>
         <w:rPr>
           <w:rtl w:val="0"/>
@@ -694,7 +674,7 @@
     <w:p>
       <w:pPr>
         <w:keepLines w:val="1"/>
-        <w:spacing w:after="0"/>
+        <w:spacing w:after="0" w:lineRule="auto"/>
         <w:rPr/>
       </w:pPr>
       <w:r>
@@ -707,7 +687,7 @@
     <w:p>
       <w:pPr>
         <w:keepLines w:val="1"/>
-        <w:spacing w:after="0"/>
+        <w:spacing w:after="0" w:lineRule="auto"/>
         <w:rPr/>
       </w:pPr>
       <w:r>
@@ -731,45 +711,33 @@
     </w:p>
     <w:p>
       <w:pPr>
-        <w:pStyle xmlns:w="http://schemas.openxmlformats.org/wordprocessingml/2006/main" w:val="Heading3"/>
-        <w:keepNext xmlns:w="http://schemas.openxmlformats.org/wordprocessingml/2006/main" w:val="0"/>
-        <w:keepLines xmlns:w="http://schemas.openxmlformats.org/wordprocessingml/2006/main" w:val="1"/>
-        <w:spacing xmlns:w="http://schemas.openxmlformats.org/wordprocessingml/2006/main" w:after="120"/>
-      </w:pPr>
-      <w:r>
-        <w:rPr>
-          <w:i xmlns:w="http://schemas.openxmlformats.org/wordprocessingml/2006/main" w:val="1"/>
-          <w:color xmlns:w="http://schemas.openxmlformats.org/wordprocessingml/2006/main" w:val="505050"/>
-          <w:sz xmlns:w="http://schemas.openxmlformats.org/wordprocessingml/2006/main" w:val="21"/>
+        <w:pStyle w:val="Heading3"/>
+        <w:keepNext w:val="0"/>
+        <w:keepLines w:val="1"/>
+        <w:spacing w:after="120" w:lineRule="auto"/>
+        <w:rPr/>
+      </w:pPr>
+      <w:r>
+        <w:rPr>
+          <w:i w:val="1"/>
+          <w:iCs w:val="1"/>
+          <w:color w:val="505050"/>
+          <w:sz w:val="21"/>
+          <w:szCs w:val="21"/>
+          <w:rtl w:val="0"/>
         </w:rPr>
         <w:t xml:space="preserve">I koden:</w:t>
-      </w:r>
-      <w:r>
-        <w:rPr>
-          <w:i xmlns:w="http://schemas.openxmlformats.org/wordprocessingml/2006/main" w:val="1"/>
-          <w:color xmlns:w="http://schemas.openxmlformats.org/wordprocessingml/2006/main" w:val="505050"/>
-          <w:sz xmlns:w="http://schemas.openxmlformats.org/wordprocessingml/2006/main" w:val="21"/>
-        </w:rPr>
-        <w:br/>
+        <w:br w:type="textWrapping"/>
         <w:t xml:space="preserve">Program.cs: AddScoped&lt;UiState&gt;().</w:t>
-      </w:r>
-      <w:r>
-        <w:rPr>
-          <w:i xmlns:w="http://schemas.openxmlformats.org/wordprocessingml/2006/main" w:val="1"/>
-          <w:color xmlns:w="http://schemas.openxmlformats.org/wordprocessingml/2006/main" w:val="505050"/>
-          <w:sz xmlns:w="http://schemas.openxmlformats.org/wordprocessingml/2006/main" w:val="21"/>
-        </w:rPr>
-        <w:br/>
+        <w:br w:type="textWrapping"/>
         <w:t xml:space="preserve">State/UiState.cs.</w:t>
-      </w:r>
-      <w:r>
-        <w:rPr>
-          <w:i xmlns:w="http://schemas.openxmlformats.org/wordprocessingml/2006/main" w:val="1"/>
-          <w:color xmlns:w="http://schemas.openxmlformats.org/wordprocessingml/2006/main" w:val="505050"/>
-          <w:sz xmlns:w="http://schemas.openxmlformats.org/wordprocessingml/2006/main" w:val="21"/>
-        </w:rPr>
-        <w:br/>
+        <w:br w:type="textWrapping"/>
         <w:t xml:space="preserve">Components/Pages/Home.razor: @bind-Language="State.Language".</w:t>
+      </w:r>
+      <w:r>
+        <w:rPr>
+          <w:rtl w:val="0"/>
+        </w:rPr>
       </w:r>
     </w:p>
     <w:p>
@@ -813,7 +781,7 @@
     <w:p>
       <w:pPr>
         <w:keepLines w:val="1"/>
-        <w:spacing w:after="0"/>
+        <w:spacing w:after="0" w:lineRule="auto"/>
         <w:rPr/>
       </w:pPr>
       <w:r>
@@ -826,7 +794,7 @@
     <w:p>
       <w:pPr>
         <w:keepLines w:val="1"/>
-        <w:spacing w:after="0"/>
+        <w:spacing w:after="0" w:lineRule="auto"/>
         <w:rPr/>
       </w:pPr>
       <w:r>
@@ -873,7 +841,7 @@
     <w:p>
       <w:pPr>
         <w:keepLines w:val="1"/>
-        <w:spacing w:after="0"/>
+        <w:spacing w:after="0" w:lineRule="auto"/>
         <w:rPr/>
       </w:pPr>
       <w:r>
@@ -886,7 +854,7 @@
     <w:p>
       <w:pPr>
         <w:keepLines w:val="1"/>
-        <w:spacing w:after="0"/>
+        <w:spacing w:after="0" w:lineRule="auto"/>
         <w:rPr/>
       </w:pPr>
       <w:r>
@@ -968,7 +936,7 @@
     <w:p>
       <w:pPr>
         <w:keepLines w:val="1"/>
-        <w:spacing w:after="0"/>
+        <w:spacing w:after="0" w:lineRule="auto"/>
         <w:rPr/>
       </w:pPr>
       <w:r>
@@ -981,7 +949,7 @@
     <w:p>
       <w:pPr>
         <w:keepLines w:val="1"/>
-        <w:spacing w:after="0"/>
+        <w:spacing w:after="0" w:lineRule="auto"/>
         <w:rPr/>
       </w:pPr>
       <w:r>
@@ -1005,45 +973,33 @@
     </w:p>
     <w:p>
       <w:pPr>
-        <w:pStyle xmlns:w="http://schemas.openxmlformats.org/wordprocessingml/2006/main" w:val="Heading3"/>
-        <w:keepNext xmlns:w="http://schemas.openxmlformats.org/wordprocessingml/2006/main" w:val="0"/>
-        <w:keepLines xmlns:w="http://schemas.openxmlformats.org/wordprocessingml/2006/main" w:val="1"/>
-        <w:spacing xmlns:w="http://schemas.openxmlformats.org/wordprocessingml/2006/main" w:after="120"/>
-      </w:pPr>
-      <w:r>
-        <w:rPr>
-          <w:i xmlns:w="http://schemas.openxmlformats.org/wordprocessingml/2006/main" w:val="1"/>
-          <w:color xmlns:w="http://schemas.openxmlformats.org/wordprocessingml/2006/main" w:val="505050"/>
-          <w:sz xmlns:w="http://schemas.openxmlformats.org/wordprocessingml/2006/main" w:val="21"/>
+        <w:pStyle w:val="Heading3"/>
+        <w:keepNext w:val="0"/>
+        <w:keepLines w:val="1"/>
+        <w:spacing w:after="120" w:lineRule="auto"/>
+        <w:rPr/>
+      </w:pPr>
+      <w:r>
+        <w:rPr>
+          <w:i w:val="1"/>
+          <w:iCs w:val="1"/>
+          <w:color w:val="505050"/>
+          <w:sz w:val="21"/>
+          <w:szCs w:val="21"/>
+          <w:rtl w:val="0"/>
         </w:rPr>
         <w:t xml:space="preserve">I koden:</w:t>
-      </w:r>
-      <w:r>
-        <w:rPr>
-          <w:i xmlns:w="http://schemas.openxmlformats.org/wordprocessingml/2006/main" w:val="1"/>
-          <w:color xmlns:w="http://schemas.openxmlformats.org/wordprocessingml/2006/main" w:val="505050"/>
-          <w:sz xmlns:w="http://schemas.openxmlformats.org/wordprocessingml/2006/main" w:val="21"/>
-        </w:rPr>
-        <w:br/>
+        <w:br w:type="textWrapping"/>
         <w:t xml:space="preserve">Program.cs: AddDbContextFactory, AddScoped&lt;Repository&gt; og AddScoped&lt;UiState&gt;.</w:t>
-      </w:r>
-      <w:r>
-        <w:rPr>
-          <w:i xmlns:w="http://schemas.openxmlformats.org/wordprocessingml/2006/main" w:val="1"/>
-          <w:color xmlns:w="http://schemas.openxmlformats.org/wordprocessingml/2006/main" w:val="505050"/>
-          <w:sz xmlns:w="http://schemas.openxmlformats.org/wordprocessingml/2006/main" w:val="21"/>
-        </w:rPr>
-        <w:br/>
+        <w:br w:type="textWrapping"/>
         <w:t xml:space="preserve">State/Language.cs.</w:t>
-      </w:r>
-      <w:r>
-        <w:rPr>
-          <w:i xmlns:w="http://schemas.openxmlformats.org/wordprocessingml/2006/main" w:val="1"/>
-          <w:color xmlns:w="http://schemas.openxmlformats.org/wordprocessingml/2006/main" w:val="505050"/>
-          <w:sz xmlns:w="http://schemas.openxmlformats.org/wordprocessingml/2006/main" w:val="21"/>
-        </w:rPr>
-        <w:br/>
+        <w:br w:type="textWrapping"/>
         <w:t xml:space="preserve">Translations.cs.</w:t>
+      </w:r>
+      <w:r>
+        <w:rPr>
+          <w:rtl w:val="0"/>
+        </w:rPr>
       </w:r>
     </w:p>
     <w:p>
@@ -1087,7 +1043,7 @@
     <w:p>
       <w:pPr>
         <w:keepLines w:val="1"/>
-        <w:spacing w:after="0"/>
+        <w:spacing w:after="0" w:lineRule="auto"/>
         <w:rPr/>
       </w:pPr>
       <w:r>
@@ -1100,7 +1056,7 @@
     <w:p>
       <w:pPr>
         <w:keepLines w:val="1"/>
-        <w:spacing w:after="0"/>
+        <w:spacing w:after="0" w:lineRule="auto"/>
         <w:rPr/>
       </w:pPr>
       <w:r>
@@ -1170,7 +1126,7 @@
     <w:p>
       <w:pPr>
         <w:keepLines w:val="1"/>
-        <w:spacing w:after="0"/>
+        <w:spacing w:after="0" w:lineRule="auto"/>
         <w:rPr/>
       </w:pPr>
       <w:r>
@@ -1183,7 +1139,7 @@
     <w:p>
       <w:pPr>
         <w:keepLines w:val="1"/>
-        <w:spacing w:after="0"/>
+        <w:spacing w:after="0" w:lineRule="auto"/>
         <w:rPr/>
       </w:pPr>
       <w:r>
@@ -1207,36 +1163,31 @@
     </w:p>
     <w:p>
       <w:pPr>
-        <w:pStyle xmlns:w="http://schemas.openxmlformats.org/wordprocessingml/2006/main" w:val="Heading3"/>
-        <w:keepNext xmlns:w="http://schemas.openxmlformats.org/wordprocessingml/2006/main" w:val="0"/>
-        <w:keepLines xmlns:w="http://schemas.openxmlformats.org/wordprocessingml/2006/main" w:val="1"/>
-        <w:spacing xmlns:w="http://schemas.openxmlformats.org/wordprocessingml/2006/main" w:after="120"/>
-      </w:pPr>
-      <w:r>
-        <w:rPr>
-          <w:i xmlns:w="http://schemas.openxmlformats.org/wordprocessingml/2006/main" w:val="1"/>
-          <w:color xmlns:w="http://schemas.openxmlformats.org/wordprocessingml/2006/main" w:val="505050"/>
-          <w:sz xmlns:w="http://schemas.openxmlformats.org/wordprocessingml/2006/main" w:val="21"/>
+        <w:pStyle w:val="Heading3"/>
+        <w:keepNext w:val="0"/>
+        <w:keepLines w:val="1"/>
+        <w:spacing w:after="120" w:lineRule="auto"/>
+        <w:rPr/>
+      </w:pPr>
+      <w:r>
+        <w:rPr>
+          <w:i w:val="1"/>
+          <w:iCs w:val="1"/>
+          <w:color w:val="505050"/>
+          <w:sz w:val="21"/>
+          <w:szCs w:val="21"/>
+          <w:rtl w:val="0"/>
         </w:rPr>
         <w:t xml:space="preserve">I koden:</w:t>
-      </w:r>
-      <w:r>
-        <w:rPr>
-          <w:i xmlns:w="http://schemas.openxmlformats.org/wordprocessingml/2006/main" w:val="1"/>
-          <w:color xmlns:w="http://schemas.openxmlformats.org/wordprocessingml/2006/main" w:val="505050"/>
-          <w:sz xmlns:w="http://schemas.openxmlformats.org/wordprocessingml/2006/main" w:val="21"/>
-        </w:rPr>
-        <w:br/>
+        <w:br w:type="textWrapping"/>
         <w:t xml:space="preserve">Components/Pages/PartialView/DatabaseTable.razor: OpenEditor.</w:t>
-      </w:r>
-      <w:r>
-        <w:rPr>
-          <w:i xmlns:w="http://schemas.openxmlformats.org/wordprocessingml/2006/main" w:val="1"/>
-          <w:color xmlns:w="http://schemas.openxmlformats.org/wordprocessingml/2006/main" w:val="505050"/>
-          <w:sz xmlns:w="http://schemas.openxmlformats.org/wordprocessingml/2006/main" w:val="21"/>
-        </w:rPr>
-        <w:br/>
+        <w:br w:type="textWrapping"/>
         <w:t xml:space="preserve">Components/Pages/PartialView/RecordEditor.razor: Save og Delete.</w:t>
+      </w:r>
+      <w:r>
+        <w:rPr>
+          <w:rtl w:val="0"/>
+        </w:rPr>
       </w:r>
     </w:p>
     <w:p>
@@ -1280,7 +1231,7 @@
     <w:p>
       <w:pPr>
         <w:keepLines w:val="1"/>
-        <w:spacing w:after="0"/>
+        <w:spacing w:after="0" w:lineRule="auto"/>
         <w:rPr/>
       </w:pPr>
       <w:r>
@@ -1293,26 +1244,14 @@
     <w:p>
       <w:pPr>
         <w:keepLines w:val="1"/>
-        <w:spacing w:after="0"/>
-        <w:rPr/>
-      </w:pPr>
-      <w:r>
-        <w:rPr>
-          <w:rtl w:val="0"/>
-        </w:rPr>
-        <w:t xml:space="preserve">Event handleren er metoden, der reagerer: @onclick kalder OpenEditor, og formularens @onsubmit kalder Save.</w:t>
-      </w:r>
-    </w:p>
-    <w:p>
-      <w:pPr>
-        <w:keepLines w:val="1"/>
-        <w:rPr/>
-      </w:pPr>
-      <w:r>
-        <w:rPr>
-          <w:rtl w:val="0"/>
-        </w:rPr>
-        <w:t xml:space="preserve">Metoden ændrer data eller tilstand, og Blazor opdaterer visningen.</w:t>
+        <w:spacing w:after="0" w:lineRule="auto"/>
+        <w:rPr/>
+      </w:pPr>
+      <w:r>
+        <w:rPr>
+          <w:rtl w:val="0"/>
+        </w:rPr>
+        <w:t xml:space="preserve">Event handleren er metoden, der reagerer: @onclick kalder OpenEditor, og formularens @onsubmit kalder Save. Metoden ændrer data eller tilstand, og Blazor opdaterer visningen.</w:t>
       </w:r>
     </w:p>
     <w:p>
@@ -1351,7 +1290,7 @@
     <w:p>
       <w:pPr>
         <w:keepLines w:val="1"/>
-        <w:spacing w:after="0"/>
+        <w:spacing w:after="0" w:lineRule="auto"/>
         <w:rPr/>
       </w:pPr>
       <w:r>
@@ -1364,7 +1303,7 @@
     <w:p>
       <w:pPr>
         <w:keepLines w:val="1"/>
-        <w:spacing w:after="0"/>
+        <w:spacing w:after="0" w:lineRule="auto"/>
         <w:rPr/>
       </w:pPr>
       <w:r>
@@ -1388,37 +1327,32 @@
     </w:p>
     <w:p>
       <w:pPr>
-        <w:pStyle xmlns:w="http://schemas.openxmlformats.org/wordprocessingml/2006/main" w:val="Heading3"/>
-        <w:keepNext xmlns:w="http://schemas.openxmlformats.org/wordprocessingml/2006/main" w:val="0"/>
-        <w:keepLines xmlns:w="http://schemas.openxmlformats.org/wordprocessingml/2006/main" w:val="1"/>
-        <w:spacing xmlns:w="http://schemas.openxmlformats.org/wordprocessingml/2006/main" w:after="120"/>
-      </w:pPr>
-      <w:r>
-        <w:rPr>
-          <w:i xmlns:w="http://schemas.openxmlformats.org/wordprocessingml/2006/main" w:val="1"/>
-          <w:color xmlns:w="http://schemas.openxmlformats.org/wordprocessingml/2006/main" w:val="505050"/>
-          <w:sz xmlns:w="http://schemas.openxmlformats.org/wordprocessingml/2006/main" w:val="21"/>
+        <w:pStyle w:val="Heading3"/>
+        <w:keepNext w:val="0"/>
+        <w:keepLines w:val="1"/>
+        <w:spacing w:after="120" w:lineRule="auto"/>
+        <w:rPr/>
+      </w:pPr>
+      <w:r>
+        <w:rPr>
+          <w:i w:val="1"/>
+          <w:iCs w:val="1"/>
+          <w:color w:val="505050"/>
+          <w:sz w:val="21"/>
+          <w:szCs w:val="21"/>
+          <w:rtl w:val="0"/>
         </w:rPr>
         <w:t xml:space="preserve">I koden:</w:t>
-      </w:r>
-      <w:r>
-        <w:rPr>
-          <w:i xmlns:w="http://schemas.openxmlformats.org/wordprocessingml/2006/main" w:val="1"/>
-          <w:color xmlns:w="http://schemas.openxmlformats.org/wordprocessingml/2006/main" w:val="505050"/>
-          <w:sz xmlns:w="http://schemas.openxmlformats.org/wordprocessingml/2006/main" w:val="21"/>
-        </w:rPr>
-        <w:br/>
+        <w:br w:type="textWrapping"/>
         <w:t xml:space="preserve">Components/Pages/PartialView/RecordEditor.razor: &lt;dialog&gt;.</w:t>
-      </w:r>
-      <w:r>
-        <w:rPr>
-          <w:i xmlns:w="http://schemas.openxmlformats.org/wordprocessingml/2006/main" w:val="1"/>
-          <w:color xmlns:w="http://schemas.openxmlformats.org/wordprocessingml/2006/main" w:val="505050"/>
-          <w:sz xmlns:w="http://schemas.openxmlformats.org/wordprocessingml/2006/main" w:val="21"/>
-        </w:rPr>
-        <w:br/>
+        <w:br w:type="textWrapping"/>
         <w:t xml:space="preserve">Components/App.razor: showRecordEditor.</w:t>
       </w:r>
+      <w:r>
+        <w:rPr>
+          <w:rtl w:val="0"/>
+        </w:rPr>
+      </w:r>
     </w:p>
     <w:p>
       <w:pPr>
@@ -1427,8 +1361,8 @@
         <w:spacing w:after="120" w:lineRule="auto"/>
         <w:rPr/>
       </w:pPr>
-      <w:bookmarkStart w:colFirst="0" w:colLast="0" w:name="_heading=h.vvih41lrb73w" w:id="10"/>
-      <w:bookmarkEnd w:id="10"/>
+      <w:bookmarkStart w:colFirst="0" w:colLast="0" w:name="_heading=h.vvih41lrb73w" w:id="2"/>
+      <w:bookmarkEnd w:id="2"/>
       <w:r>
         <w:rPr>
           <w:rtl w:val="0"/>
@@ -1460,7 +1394,7 @@
     <w:p>
       <w:pPr>
         <w:keepLines w:val="1"/>
-        <w:spacing w:after="0"/>
+        <w:spacing w:after="0" w:lineRule="auto"/>
         <w:rPr/>
       </w:pPr>
       <w:r>
@@ -1473,7 +1407,7 @@
     <w:p>
       <w:pPr>
         <w:keepLines w:val="1"/>
-        <w:spacing w:after="0"/>
+        <w:spacing w:after="0" w:lineRule="auto"/>
         <w:rPr/>
       </w:pPr>
       <w:r>
@@ -1497,45 +1431,33 @@
     </w:p>
     <w:p>
       <w:pPr>
-        <w:pStyle xmlns:w="http://schemas.openxmlformats.org/wordprocessingml/2006/main" w:val="Heading3"/>
-        <w:keepNext xmlns:w="http://schemas.openxmlformats.org/wordprocessingml/2006/main" w:val="0"/>
-        <w:keepLines xmlns:w="http://schemas.openxmlformats.org/wordprocessingml/2006/main" w:val="1"/>
-        <w:spacing xmlns:w="http://schemas.openxmlformats.org/wordprocessingml/2006/main" w:after="120"/>
-      </w:pPr>
-      <w:r>
-        <w:rPr>
-          <w:i xmlns:w="http://schemas.openxmlformats.org/wordprocessingml/2006/main" w:val="1"/>
-          <w:color xmlns:w="http://schemas.openxmlformats.org/wordprocessingml/2006/main" w:val="505050"/>
-          <w:sz xmlns:w="http://schemas.openxmlformats.org/wordprocessingml/2006/main" w:val="21"/>
+        <w:pStyle w:val="Heading3"/>
+        <w:keepNext w:val="0"/>
+        <w:keepLines w:val="1"/>
+        <w:spacing w:after="120" w:lineRule="auto"/>
+        <w:rPr/>
+      </w:pPr>
+      <w:r>
+        <w:rPr>
+          <w:i w:val="1"/>
+          <w:iCs w:val="1"/>
+          <w:color w:val="505050"/>
+          <w:sz w:val="21"/>
+          <w:szCs w:val="21"/>
+          <w:rtl w:val="0"/>
         </w:rPr>
         <w:t xml:space="preserve">I koden:</w:t>
-      </w:r>
-      <w:r>
-        <w:rPr>
-          <w:i xmlns:w="http://schemas.openxmlformats.org/wordprocessingml/2006/main" w:val="1"/>
-          <w:color xmlns:w="http://schemas.openxmlformats.org/wordprocessingml/2006/main" w:val="505050"/>
-          <w:sz xmlns:w="http://schemas.openxmlformats.org/wordprocessingml/2006/main" w:val="21"/>
-        </w:rPr>
-        <w:br/>
+        <w:br w:type="textWrapping"/>
         <w:t xml:space="preserve">DBAccess/Repository.cs: SaveChanges.</w:t>
-      </w:r>
-      <w:r>
-        <w:rPr>
-          <w:i xmlns:w="http://schemas.openxmlformats.org/wordprocessingml/2006/main" w:val="1"/>
-          <w:color xmlns:w="http://schemas.openxmlformats.org/wordprocessingml/2006/main" w:val="505050"/>
-          <w:sz xmlns:w="http://schemas.openxmlformats.org/wordprocessingml/2006/main" w:val="21"/>
-        </w:rPr>
-        <w:br/>
+        <w:br w:type="textWrapping"/>
         <w:t xml:space="preserve">Components/Pages/PartialView/DatabaseTable.razor: RecordSaved og DataChanged.</w:t>
-      </w:r>
-      <w:r>
-        <w:rPr>
-          <w:i xmlns:w="http://schemas.openxmlformats.org/wordprocessingml/2006/main" w:val="1"/>
-          <w:color xmlns:w="http://schemas.openxmlformats.org/wordprocessingml/2006/main" w:val="505050"/>
-          <w:sz xmlns:w="http://schemas.openxmlformats.org/wordprocessingml/2006/main" w:val="21"/>
-        </w:rPr>
-        <w:br/>
+        <w:br w:type="textWrapping"/>
         <w:t xml:space="preserve">Components/Pages/Home.razor: RefreshOverview.</w:t>
+      </w:r>
+      <w:r>
+        <w:rPr>
+          <w:rtl w:val="0"/>
+        </w:rPr>
       </w:r>
     </w:p>
     <w:p>
@@ -1563,7 +1485,7 @@
     <w:p>
       <w:pPr>
         <w:keepLines w:val="1"/>
-        <w:spacing w:after="0"/>
+        <w:spacing w:after="0" w:lineRule="auto"/>
         <w:rPr/>
       </w:pPr>
       <w:r>
@@ -1576,7 +1498,7 @@
     <w:p>
       <w:pPr>
         <w:keepLines w:val="1"/>
-        <w:spacing w:after="0"/>
+        <w:spacing w:after="0" w:lineRule="auto"/>
         <w:rPr/>
       </w:pPr>
       <w:r>
@@ -1600,36 +1522,31 @@
     </w:p>
     <w:p>
       <w:pPr>
-        <w:pStyle xmlns:w="http://schemas.openxmlformats.org/wordprocessingml/2006/main" w:val="Heading3"/>
-        <w:keepNext xmlns:w="http://schemas.openxmlformats.org/wordprocessingml/2006/main" w:val="0"/>
-        <w:keepLines xmlns:w="http://schemas.openxmlformats.org/wordprocessingml/2006/main" w:val="1"/>
-        <w:spacing xmlns:w="http://schemas.openxmlformats.org/wordprocessingml/2006/main" w:after="120"/>
-      </w:pPr>
-      <w:r>
-        <w:rPr>
-          <w:i xmlns:w="http://schemas.openxmlformats.org/wordprocessingml/2006/main" w:val="1"/>
-          <w:color xmlns:w="http://schemas.openxmlformats.org/wordprocessingml/2006/main" w:val="505050"/>
-          <w:sz xmlns:w="http://schemas.openxmlformats.org/wordprocessingml/2006/main" w:val="21"/>
+        <w:pStyle w:val="Heading3"/>
+        <w:keepNext w:val="0"/>
+        <w:keepLines w:val="1"/>
+        <w:spacing w:after="120" w:lineRule="auto"/>
+        <w:rPr/>
+      </w:pPr>
+      <w:r>
+        <w:rPr>
+          <w:i w:val="1"/>
+          <w:iCs w:val="1"/>
+          <w:color w:val="505050"/>
+          <w:sz w:val="21"/>
+          <w:szCs w:val="21"/>
+          <w:rtl w:val="0"/>
         </w:rPr>
         <w:t xml:space="preserve">I koden:</w:t>
-      </w:r>
-      <w:r>
-        <w:rPr>
-          <w:i xmlns:w="http://schemas.openxmlformats.org/wordprocessingml/2006/main" w:val="1"/>
-          <w:color xmlns:w="http://schemas.openxmlformats.org/wordprocessingml/2006/main" w:val="505050"/>
-          <w:sz xmlns:w="http://schemas.openxmlformats.org/wordprocessingml/2006/main" w:val="21"/>
-        </w:rPr>
-        <w:br/>
+        <w:br w:type="textWrapping"/>
         <w:t xml:space="preserve">Components/Pages/PartialView/RecordEditor.razor: IsReadOnly, originalValues og Save.</w:t>
-      </w:r>
-      <w:r>
-        <w:rPr>
-          <w:i xmlns:w="http://schemas.openxmlformats.org/wordprocessingml/2006/main" w:val="1"/>
-          <w:color xmlns:w="http://schemas.openxmlformats.org/wordprocessingml/2006/main" w:val="505050"/>
-          <w:sz xmlns:w="http://schemas.openxmlformats.org/wordprocessingml/2006/main" w:val="21"/>
-        </w:rPr>
-        <w:br/>
+        <w:br w:type="textWrapping"/>
         <w:t xml:space="preserve">DBAccess/Repository.cs: MissingSchemaAction.AddWithKey henter også oplysninger om primærnøglen.</w:t>
+      </w:r>
+      <w:r>
+        <w:rPr>
+          <w:rtl w:val="0"/>
+        </w:rPr>
       </w:r>
     </w:p>
     <w:p>
@@ -1673,7 +1590,7 @@
     <w:p>
       <w:pPr>
         <w:keepLines w:val="1"/>
-        <w:spacing w:after="0"/>
+        <w:spacing w:after="0" w:lineRule="auto"/>
         <w:rPr/>
       </w:pPr>
       <w:r>
@@ -1686,7 +1603,7 @@
     <w:p>
       <w:pPr>
         <w:keepLines w:val="1"/>
-        <w:spacing w:after="0"/>
+        <w:spacing w:after="0" w:lineRule="auto"/>
         <w:rPr/>
       </w:pPr>
       <w:r>
@@ -1710,45 +1627,33 @@
     </w:p>
     <w:p>
       <w:pPr>
-        <w:pStyle xmlns:w="http://schemas.openxmlformats.org/wordprocessingml/2006/main" w:val="Heading3"/>
-        <w:keepNext xmlns:w="http://schemas.openxmlformats.org/wordprocessingml/2006/main" w:val="0"/>
-        <w:keepLines xmlns:w="http://schemas.openxmlformats.org/wordprocessingml/2006/main" w:val="1"/>
-        <w:spacing xmlns:w="http://schemas.openxmlformats.org/wordprocessingml/2006/main" w:after="120"/>
-      </w:pPr>
-      <w:r>
-        <w:rPr>
-          <w:i xmlns:w="http://schemas.openxmlformats.org/wordprocessingml/2006/main" w:val="1"/>
-          <w:color xmlns:w="http://schemas.openxmlformats.org/wordprocessingml/2006/main" w:val="505050"/>
-          <w:sz xmlns:w="http://schemas.openxmlformats.org/wordprocessingml/2006/main" w:val="21"/>
+        <w:pStyle w:val="Heading3"/>
+        <w:keepNext w:val="0"/>
+        <w:keepLines w:val="1"/>
+        <w:spacing w:after="120" w:lineRule="auto"/>
+        <w:rPr/>
+      </w:pPr>
+      <w:r>
+        <w:rPr>
+          <w:i w:val="1"/>
+          <w:iCs w:val="1"/>
+          <w:color w:val="505050"/>
+          <w:sz w:val="21"/>
+          <w:szCs w:val="21"/>
+          <w:rtl w:val="0"/>
         </w:rPr>
         <w:t xml:space="preserve">I koden:</w:t>
-      </w:r>
-      <w:r>
-        <w:rPr>
-          <w:i xmlns:w="http://schemas.openxmlformats.org/wordprocessingml/2006/main" w:val="1"/>
-          <w:color xmlns:w="http://schemas.openxmlformats.org/wordprocessingml/2006/main" w:val="505050"/>
-          <w:sz xmlns:w="http://schemas.openxmlformats.org/wordprocessingml/2006/main" w:val="21"/>
-        </w:rPr>
-        <w:br/>
+        <w:br w:type="textWrapping"/>
         <w:t xml:space="preserve">Components/Pages/PartialView/DatabaseTable.razor: changesSaved.</w:t>
-      </w:r>
-      <w:r>
-        <w:rPr>
-          <w:i xmlns:w="http://schemas.openxmlformats.org/wordprocessingml/2006/main" w:val="1"/>
-          <w:color xmlns:w="http://schemas.openxmlformats.org/wordprocessingml/2006/main" w:val="505050"/>
-          <w:sz xmlns:w="http://schemas.openxmlformats.org/wordprocessingml/2006/main" w:val="21"/>
-        </w:rPr>
-        <w:br/>
+        <w:br w:type="textWrapping"/>
         <w:t xml:space="preserve">Components/Pages/PartialView/RecordEditor.razor: errorMessage og catch.</w:t>
-      </w:r>
-      <w:r>
-        <w:rPr>
-          <w:i xmlns:w="http://schemas.openxmlformats.org/wordprocessingml/2006/main" w:val="1"/>
-          <w:color xmlns:w="http://schemas.openxmlformats.org/wordprocessingml/2006/main" w:val="505050"/>
-          <w:sz xmlns:w="http://schemas.openxmlformats.org/wordprocessingml/2006/main" w:val="21"/>
-        </w:rPr>
-        <w:br/>
+        <w:br w:type="textWrapping"/>
         <w:t xml:space="preserve">Translations.cs: ChangesSaved, SaveError og DeleteError.</w:t>
+      </w:r>
+      <w:r>
+        <w:rPr>
+          <w:rtl w:val="0"/>
+        </w:rPr>
       </w:r>
     </w:p>
     <w:p>
@@ -1799,7 +1704,7 @@
     <w:p>
       <w:pPr>
         <w:keepLines w:val="1"/>
-        <w:spacing w:after="0"/>
+        <w:spacing w:after="0" w:lineRule="auto"/>
         <w:rPr/>
       </w:pPr>
       <w:r>
@@ -1812,7 +1717,7 @@
     <w:p>
       <w:pPr>
         <w:keepLines w:val="1"/>
-        <w:spacing w:after="0"/>
+        <w:spacing w:after="0" w:lineRule="auto"/>
         <w:rPr/>
       </w:pPr>
       <w:r>
@@ -1836,54 +1741,35 @@
     </w:p>
     <w:p>
       <w:pPr>
-        <w:pStyle xmlns:w="http://schemas.openxmlformats.org/wordprocessingml/2006/main" w:val="Heading3"/>
-        <w:keepNext xmlns:w="http://schemas.openxmlformats.org/wordprocessingml/2006/main" w:val="0"/>
-        <w:keepLines xmlns:w="http://schemas.openxmlformats.org/wordprocessingml/2006/main" w:val="1"/>
-        <w:spacing xmlns:w="http://schemas.openxmlformats.org/wordprocessingml/2006/main" w:after="120"/>
-      </w:pPr>
-      <w:r>
-        <w:rPr>
-          <w:i xmlns:w="http://schemas.openxmlformats.org/wordprocessingml/2006/main" w:val="1"/>
-          <w:color xmlns:w="http://schemas.openxmlformats.org/wordprocessingml/2006/main" w:val="505050"/>
-          <w:sz xmlns:w="http://schemas.openxmlformats.org/wordprocessingml/2006/main" w:val="21"/>
+        <w:pStyle w:val="Heading3"/>
+        <w:keepNext w:val="0"/>
+        <w:keepLines w:val="1"/>
+        <w:spacing w:after="120" w:lineRule="auto"/>
+        <w:rPr/>
+      </w:pPr>
+      <w:r>
+        <w:rPr>
+          <w:i w:val="1"/>
+          <w:iCs w:val="1"/>
+          <w:color w:val="505050"/>
+          <w:sz w:val="21"/>
+          <w:szCs w:val="21"/>
+          <w:rtl w:val="0"/>
         </w:rPr>
         <w:t xml:space="preserve">I koden:</w:t>
-      </w:r>
-      <w:r>
-        <w:rPr>
-          <w:i xmlns:w="http://schemas.openxmlformats.org/wordprocessingml/2006/main" w:val="1"/>
-          <w:color xmlns:w="http://schemas.openxmlformats.org/wordprocessingml/2006/main" w:val="505050"/>
-          <w:sz xmlns:w="http://schemas.openxmlformats.org/wordprocessingml/2006/main" w:val="21"/>
-        </w:rPr>
-        <w:br/>
+        <w:br w:type="textWrapping"/>
         <w:t xml:space="preserve">Program.cs: builder.Services og app.Run().</w:t>
-      </w:r>
-      <w:r>
-        <w:rPr>
-          <w:i xmlns:w="http://schemas.openxmlformats.org/wordprocessingml/2006/main" w:val="1"/>
-          <w:color xmlns:w="http://schemas.openxmlformats.org/wordprocessingml/2006/main" w:val="505050"/>
-          <w:sz xmlns:w="http://schemas.openxmlformats.org/wordprocessingml/2006/main" w:val="21"/>
-        </w:rPr>
-        <w:br/>
+        <w:br w:type="textWrapping"/>
         <w:t xml:space="preserve">Components/Pages/Home.razor: OnInitialized.</w:t>
-      </w:r>
-      <w:r>
-        <w:rPr>
-          <w:i xmlns:w="http://schemas.openxmlformats.org/wordprocessingml/2006/main" w:val="1"/>
-          <w:color xmlns:w="http://schemas.openxmlformats.org/wordprocessingml/2006/main" w:val="505050"/>
-          <w:sz xmlns:w="http://schemas.openxmlformats.org/wordprocessingml/2006/main" w:val="21"/>
-        </w:rPr>
-        <w:br/>
+        <w:br w:type="textWrapping"/>
         <w:t xml:space="preserve">Components/Pages/CustomControls/DBService.razor: OnInitialized.</w:t>
-      </w:r>
-      <w:r>
-        <w:rPr>
-          <w:i xmlns:w="http://schemas.openxmlformats.org/wordprocessingml/2006/main" w:val="1"/>
-          <w:color xmlns:w="http://schemas.openxmlformats.org/wordprocessingml/2006/main" w:val="505050"/>
-          <w:sz xmlns:w="http://schemas.openxmlformats.org/wordprocessingml/2006/main" w:val="21"/>
-        </w:rPr>
-        <w:br/>
+        <w:br w:type="textWrapping"/>
         <w:t xml:space="preserve">Components/Pages/PartialView/DatabaseTable.razor: OnInitialized.</w:t>
+      </w:r>
+      <w:r>
+        <w:rPr>
+          <w:rtl w:val="0"/>
+        </w:rPr>
       </w:r>
     </w:p>
     <w:p>
@@ -1921,7 +1807,7 @@
     <w:p>
       <w:pPr>
         <w:keepLines w:val="1"/>
-        <w:spacing w:after="0"/>
+        <w:spacing w:after="0" w:lineRule="auto"/>
         <w:rPr/>
       </w:pPr>
       <w:r>
@@ -1934,7 +1820,7 @@
     <w:p>
       <w:pPr>
         <w:keepLines w:val="1"/>
-        <w:spacing w:after="0"/>
+        <w:spacing w:after="0" w:lineRule="auto"/>
         <w:rPr/>
       </w:pPr>
       <w:r>
@@ -1947,7 +1833,7 @@
     <w:p>
       <w:pPr>
         <w:keepLines w:val="1"/>
-        <w:spacing w:after="0"/>
+        <w:spacing w:after="0" w:lineRule="auto"/>
         <w:rPr/>
       </w:pPr>
       <w:r>
@@ -2005,7 +1891,7 @@
     <w:p>
       <w:pPr>
         <w:keepLines w:val="1"/>
-        <w:spacing w:after="0"/>
+        <w:spacing w:after="0" w:lineRule="auto"/>
         <w:rPr/>
       </w:pPr>
       <w:r>
@@ -2029,36 +1915,31 @@
     </w:p>
     <w:p>
       <w:pPr>
-        <w:pStyle xmlns:w="http://schemas.openxmlformats.org/wordprocessingml/2006/main" w:val="Heading3"/>
-        <w:keepNext xmlns:w="http://schemas.openxmlformats.org/wordprocessingml/2006/main" w:val="0"/>
-        <w:keepLines xmlns:w="http://schemas.openxmlformats.org/wordprocessingml/2006/main" w:val="1"/>
-        <w:spacing xmlns:w="http://schemas.openxmlformats.org/wordprocessingml/2006/main" w:after="120"/>
-      </w:pPr>
-      <w:r>
-        <w:rPr>
-          <w:i xmlns:w="http://schemas.openxmlformats.org/wordprocessingml/2006/main" w:val="1"/>
-          <w:color xmlns:w="http://schemas.openxmlformats.org/wordprocessingml/2006/main" w:val="505050"/>
-          <w:sz xmlns:w="http://schemas.openxmlformats.org/wordprocessingml/2006/main" w:val="21"/>
+        <w:pStyle w:val="Heading3"/>
+        <w:keepNext w:val="0"/>
+        <w:keepLines w:val="1"/>
+        <w:spacing w:after="120" w:lineRule="auto"/>
+        <w:rPr/>
+      </w:pPr>
+      <w:r>
+        <w:rPr>
+          <w:i w:val="1"/>
+          <w:iCs w:val="1"/>
+          <w:color w:val="505050"/>
+          <w:sz w:val="21"/>
+          <w:szCs w:val="21"/>
+          <w:rtl w:val="0"/>
         </w:rPr>
         <w:t xml:space="preserve">I koden:</w:t>
-      </w:r>
-      <w:r>
-        <w:rPr>
-          <w:i xmlns:w="http://schemas.openxmlformats.org/wordprocessingml/2006/main" w:val="1"/>
-          <w:color xmlns:w="http://schemas.openxmlformats.org/wordprocessingml/2006/main" w:val="505050"/>
-          <w:sz xmlns:w="http://schemas.openxmlformats.org/wordprocessingml/2006/main" w:val="21"/>
-        </w:rPr>
-        <w:br/>
+        <w:br w:type="textWrapping"/>
         <w:t xml:space="preserve">Components/Pages/PartialView/RecordEditor.razor: OnAfterRenderAsync.</w:t>
-      </w:r>
-      <w:r>
-        <w:rPr>
-          <w:i xmlns:w="http://schemas.openxmlformats.org/wordprocessingml/2006/main" w:val="1"/>
-          <w:color xmlns:w="http://schemas.openxmlformats.org/wordprocessingml/2006/main" w:val="505050"/>
-          <w:sz xmlns:w="http://schemas.openxmlformats.org/wordprocessingml/2006/main" w:val="21"/>
-        </w:rPr>
-        <w:br/>
+        <w:br w:type="textWrapping"/>
         <w:t xml:space="preserve">Components/App.razor: showRecordEditor.</w:t>
+      </w:r>
+      <w:r>
+        <w:rPr>
+          <w:rtl w:val="0"/>
+        </w:rPr>
       </w:r>
     </w:p>
     <w:p>
@@ -2096,7 +1977,7 @@
     <w:p>
       <w:pPr>
         <w:keepLines w:val="1"/>
-        <w:spacing w:after="0"/>
+        <w:spacing w:after="0" w:lineRule="auto"/>
         <w:rPr/>
       </w:pPr>
       <w:r>
@@ -2109,7 +1990,7 @@
     <w:p>
       <w:pPr>
         <w:keepLines w:val="1"/>
-        <w:spacing w:after="0"/>
+        <w:spacing w:after="0" w:lineRule="auto"/>
         <w:rPr/>
       </w:pPr>
       <w:r>
@@ -2133,36 +2014,31 @@
     </w:p>
     <w:p>
       <w:pPr>
-        <w:pStyle xmlns:w="http://schemas.openxmlformats.org/wordprocessingml/2006/main" w:val="Heading3"/>
-        <w:keepNext xmlns:w="http://schemas.openxmlformats.org/wordprocessingml/2006/main" w:val="0"/>
-        <w:keepLines xmlns:w="http://schemas.openxmlformats.org/wordprocessingml/2006/main" w:val="1"/>
-        <w:spacing xmlns:w="http://schemas.openxmlformats.org/wordprocessingml/2006/main" w:after="120"/>
-      </w:pPr>
-      <w:r>
-        <w:rPr>
-          <w:i xmlns:w="http://schemas.openxmlformats.org/wordprocessingml/2006/main" w:val="1"/>
-          <w:color xmlns:w="http://schemas.openxmlformats.org/wordprocessingml/2006/main" w:val="505050"/>
-          <w:sz xmlns:w="http://schemas.openxmlformats.org/wordprocessingml/2006/main" w:val="21"/>
+        <w:pStyle w:val="Heading3"/>
+        <w:keepNext w:val="0"/>
+        <w:keepLines w:val="1"/>
+        <w:spacing w:after="120" w:lineRule="auto"/>
+        <w:rPr/>
+      </w:pPr>
+      <w:r>
+        <w:rPr>
+          <w:i w:val="1"/>
+          <w:iCs w:val="1"/>
+          <w:color w:val="505050"/>
+          <w:sz w:val="21"/>
+          <w:szCs w:val="21"/>
+          <w:rtl w:val="0"/>
         </w:rPr>
         <w:t xml:space="preserve">I koden:</w:t>
-      </w:r>
-      <w:r>
-        <w:rPr>
-          <w:i xmlns:w="http://schemas.openxmlformats.org/wordprocessingml/2006/main" w:val="1"/>
-          <w:color xmlns:w="http://schemas.openxmlformats.org/wordprocessingml/2006/main" w:val="505050"/>
-          <w:sz xmlns:w="http://schemas.openxmlformats.org/wordprocessingml/2006/main" w:val="21"/>
-        </w:rPr>
-        <w:br/>
+        <w:br w:type="textWrapping"/>
         <w:t xml:space="preserve">Components/Pages/CustomControls/DBService.razor: LoadTable.</w:t>
-      </w:r>
-      <w:r>
-        <w:rPr>
-          <w:i xmlns:w="http://schemas.openxmlformats.org/wordprocessingml/2006/main" w:val="1"/>
-          <w:color xmlns:w="http://schemas.openxmlformats.org/wordprocessingml/2006/main" w:val="505050"/>
-          <w:sz xmlns:w="http://schemas.openxmlformats.org/wordprocessingml/2006/main" w:val="21"/>
-        </w:rPr>
-        <w:br/>
+        <w:br w:type="textWrapping"/>
         <w:t xml:space="preserve">DBAccess/Repository.cs: GetTableNames og GetRecordCount.</w:t>
+      </w:r>
+      <w:r>
+        <w:rPr>
+          <w:rtl w:val="0"/>
+        </w:rPr>
       </w:r>
     </w:p>
     <w:p>
@@ -2206,7 +2082,7 @@
     <w:p>
       <w:pPr>
         <w:keepLines w:val="1"/>
-        <w:spacing w:after="0"/>
+        <w:spacing w:after="0" w:lineRule="auto"/>
         <w:rPr/>
       </w:pPr>
       <w:r>
@@ -2219,7 +2095,7 @@
     <w:p>
       <w:pPr>
         <w:keepLines w:val="1"/>
-        <w:spacing w:after="0"/>
+        <w:spacing w:after="0" w:lineRule="auto"/>
         <w:rPr/>
       </w:pPr>
       <w:r>
@@ -2277,7 +2153,7 @@
     <w:p>
       <w:pPr>
         <w:keepLines w:val="1"/>
-        <w:spacing w:after="0"/>
+        <w:spacing w:after="0" w:lineRule="auto"/>
         <w:rPr/>
       </w:pPr>
       <w:r>
@@ -2290,7 +2166,7 @@
     <w:p>
       <w:pPr>
         <w:keepLines w:val="1"/>
-        <w:spacing w:after="0"/>
+        <w:spacing w:after="0" w:lineRule="auto"/>
         <w:rPr/>
       </w:pPr>
       <w:r>
@@ -2378,7 +2254,7 @@
     <w:p>
       <w:pPr>
         <w:keepLines w:val="1"/>
-        <w:spacing w:after="0"/>
+        <w:spacing w:after="0" w:lineRule="auto"/>
         <w:rPr/>
       </w:pPr>
       <w:r>
@@ -2391,7 +2267,7 @@
     <w:p>
       <w:pPr>
         <w:keepLines w:val="1"/>
-        <w:spacing w:after="0"/>
+        <w:spacing w:after="0" w:lineRule="auto"/>
         <w:rPr/>
       </w:pPr>
       <w:r>
@@ -2411,17 +2287,6 @@
           <w:rtl w:val="0"/>
         </w:rPr>
         <w:t xml:space="preserve">De skal kunne udføre arbejdet uden at kende SQL.</w:t>
-      </w:r>
-    </w:p>
-    <w:p>
-      <w:pPr>
-        <w:keepLines w:val="1"/>
-        <w:rPr/>
-      </w:pPr>
-      <w:r>
-        <w:rPr>
-          <w:rtl w:val="0"/>
-        </w:rPr>
       </w:r>
     </w:p>
     <w:p>
@@ -2449,7 +2314,7 @@
     <w:p>
       <w:pPr>
         <w:keepLines w:val="1"/>
-        <w:spacing w:after="0"/>
+        <w:spacing w:after="0" w:lineRule="auto"/>
         <w:rPr/>
       </w:pPr>
       <w:r>
@@ -2462,7 +2327,7 @@
     <w:p>
       <w:pPr>
         <w:keepLines w:val="1"/>
-        <w:spacing w:after="0"/>
+        <w:spacing w:after="0" w:lineRule="auto"/>
         <w:rPr/>
       </w:pPr>
       <w:r>
@@ -2560,27 +2425,27 @@
     <w:p>
       <w:pPr>
         <w:keepLines w:val="1"/>
-        <w:spacing w:after="0"/>
-        <w:rPr/>
-      </w:pPr>
-      <w:r>
-        <w:rPr>
-          <w:rtl w:val="0"/>
-        </w:rPr>
-        <w:t xml:space="preserve">Vi har valgt at gøre sprogmenuen til en custom component.</w:t>
-      </w:r>
-    </w:p>
-    <w:p>
-      <w:pPr>
-        <w:keepLines w:val="1"/>
-        <w:spacing w:after="0"/>
-        <w:rPr/>
-      </w:pPr>
-      <w:r>
-        <w:rPr>
-          <w:rtl w:val="0"/>
-        </w:rPr>
-        <w:t xml:space="preserve">LanguageSelector samler billede, dropdown og beskeden om sprogændring i én genbrugelig kontrol.</w:t>
+        <w:spacing w:after="0" w:lineRule="auto"/>
+        <w:rPr/>
+      </w:pPr>
+      <w:r>
+        <w:rPr>
+          <w:rtl w:val="0"/>
+        </w:rPr>
+        <w:t xml:space="preserve">Jeg har valgt at gøre sprogmenuen til en custom component.</w:t>
+      </w:r>
+    </w:p>
+    <w:p>
+      <w:pPr>
+        <w:keepLines w:val="1"/>
+        <w:spacing w:after="0" w:lineRule="auto"/>
+        <w:rPr/>
+      </w:pPr>
+      <w:r>
+        <w:rPr>
+          <w:rtl w:val="0"/>
+        </w:rPr>
+        <w:t xml:space="preserve">LanguageSelector samler ikon, dropdown og beskeden om sprogændring i én genbrugelig kontrol.</w:t>
       </w:r>
     </w:p>
     <w:p>
@@ -2597,36 +2462,31 @@
     </w:p>
     <w:p>
       <w:pPr>
-        <w:pStyle xmlns:w="http://schemas.openxmlformats.org/wordprocessingml/2006/main" w:val="Heading3"/>
-        <w:keepNext xmlns:w="http://schemas.openxmlformats.org/wordprocessingml/2006/main" w:val="0"/>
-        <w:keepLines xmlns:w="http://schemas.openxmlformats.org/wordprocessingml/2006/main" w:val="1"/>
-        <w:spacing xmlns:w="http://schemas.openxmlformats.org/wordprocessingml/2006/main" w:after="120"/>
-      </w:pPr>
-      <w:r>
-        <w:rPr>
-          <w:i xmlns:w="http://schemas.openxmlformats.org/wordprocessingml/2006/main" w:val="1"/>
-          <w:color xmlns:w="http://schemas.openxmlformats.org/wordprocessingml/2006/main" w:val="505050"/>
-          <w:sz xmlns:w="http://schemas.openxmlformats.org/wordprocessingml/2006/main" w:val="21"/>
+        <w:pStyle w:val="Heading3"/>
+        <w:keepNext w:val="0"/>
+        <w:keepLines w:val="1"/>
+        <w:spacing w:after="120" w:lineRule="auto"/>
+        <w:rPr/>
+      </w:pPr>
+      <w:r>
+        <w:rPr>
+          <w:i w:val="1"/>
+          <w:iCs w:val="1"/>
+          <w:color w:val="505050"/>
+          <w:sz w:val="21"/>
+          <w:szCs w:val="21"/>
+          <w:rtl w:val="0"/>
         </w:rPr>
         <w:t xml:space="preserve">I koden:</w:t>
-      </w:r>
-      <w:r>
-        <w:rPr>
-          <w:i xmlns:w="http://schemas.openxmlformats.org/wordprocessingml/2006/main" w:val="1"/>
-          <w:color xmlns:w="http://schemas.openxmlformats.org/wordprocessingml/2006/main" w:val="505050"/>
-          <w:sz xmlns:w="http://schemas.openxmlformats.org/wordprocessingml/2006/main" w:val="21"/>
-        </w:rPr>
-        <w:br/>
+        <w:br w:type="textWrapping"/>
         <w:t xml:space="preserve">Components/Pages/CustomControls/LanguageSelector.razor: ChangeLanguage.</w:t>
-      </w:r>
-      <w:r>
-        <w:rPr>
-          <w:i xmlns:w="http://schemas.openxmlformats.org/wordprocessingml/2006/main" w:val="1"/>
-          <w:color xmlns:w="http://schemas.openxmlformats.org/wordprocessingml/2006/main" w:val="505050"/>
-          <w:sz xmlns:w="http://schemas.openxmlformats.org/wordprocessingml/2006/main" w:val="21"/>
-        </w:rPr>
-        <w:br/>
+        <w:br w:type="textWrapping"/>
         <w:t xml:space="preserve">Components/Pages/Home.razor: &lt;LanguageSelector @bind-Language="State.Language" /&gt;.</w:t>
+      </w:r>
+      <w:r>
+        <w:rPr>
+          <w:rtl w:val="0"/>
+        </w:rPr>
       </w:r>
     </w:p>
     <w:p>
@@ -2654,7 +2514,7 @@
     <w:p>
       <w:pPr>
         <w:keepLines w:val="1"/>
-        <w:spacing w:after="0"/>
+        <w:spacing w:after="0" w:lineRule="auto"/>
         <w:rPr/>
       </w:pPr>
       <w:r>
@@ -2667,7 +2527,7 @@
     <w:p>
       <w:pPr>
         <w:keepLines w:val="1"/>
-        <w:spacing w:after="0"/>
+        <w:spacing w:after="0" w:lineRule="auto"/>
         <w:rPr/>
       </w:pPr>
       <w:r>
@@ -2680,13 +2540,23 @@
     <w:p>
       <w:pPr>
         <w:keepLines w:val="1"/>
-        <w:rPr/>
+        <w:rPr>
+          <w:b w:val="1"/>
+          <w:bCs w:val="1"/>
+          <w:sz w:val="23"/>
+          <w:szCs w:val="23"/>
+        </w:rPr>
       </w:pPr>
       <w:r>
         <w:rPr>
           <w:rtl w:val="0"/>
         </w:rPr>
         <w:t xml:space="preserve">Partial view beskriver en del af sidens indhold, fx tabellen eller formularen; det er ikke et separat MVC-partial view.</w:t>
+      </w:r>
+      <w:r>
+        <w:rPr>
+          <w:rtl w:val="0"/>
+        </w:rPr>
       </w:r>
     </w:p>
     <w:p>
@@ -2702,23 +2572,6 @@
       </w:pPr>
       <w:r>
         <w:rPr>
-          <w:rtl w:val="0"/>
-        </w:rPr>
-      </w:r>
-    </w:p>
-    <w:p>
-      <w:pPr>
-        <w:pStyle w:val="Heading2"/>
-        <w:spacing w:after="60" w:before="160" w:lineRule="auto"/>
-        <w:rPr>
-          <w:b w:val="1"/>
-          <w:bCs w:val="1"/>
-          <w:sz w:val="23"/>
-          <w:szCs w:val="23"/>
-        </w:rPr>
-      </w:pPr>
-      <w:r>
-        <w:rPr>
           <w:b w:val="1"/>
           <w:bCs w:val="1"/>
           <w:sz w:val="23"/>
@@ -2731,90 +2584,14 @@
     <w:p>
       <w:pPr>
         <w:keepLines w:val="1"/>
-        <w:spacing w:after="0"/>
-        <w:rPr/>
-      </w:pPr>
-      <w:r>
-        <w:rPr>
-          <w:rtl w:val="0"/>
-        </w:rPr>
-        <w:t xml:space="preserve">Opgaven lægger op til fem personer fra klassen.</w:t>
-      </w:r>
-    </w:p>
-    <w:p>
-      <w:pPr>
-        <w:keepLines w:val="1"/>
-        <w:spacing w:after="0"/>
-        <w:rPr/>
-      </w:pPr>
-      <w:r>
-        <w:rPr>
-          <w:rtl w:val="0"/>
-        </w:rPr>
-        <w:t xml:space="preserve">Giv dem samme opgaver: opret en testadresse, ret husnummeret, skift sprog og slet testadressen.</w:t>
-      </w:r>
-    </w:p>
-    <w:p>
-      <w:pPr>
-        <w:keepLines w:val="1"/>
-        <w:spacing w:after="0"/>
-        <w:rPr/>
-      </w:pPr>
-      <w:r>
-        <w:rPr>
-          <w:rtl w:val="0"/>
-        </w:rPr>
-        <w:t xml:space="preserve">Lad dem gentage en handling efter en pause, og notér tid, fejl og behov for hjælp.</w:t>
-      </w:r>
-    </w:p>
-    <w:p>
-      <w:pPr>
-        <w:keepLines w:val="1"/>
-        <w:rPr/>
-      </w:pPr>
-      <w:r>
-        <w:rPr>
-          <w:rtl w:val="0"/>
-        </w:rPr>
-        <w:t xml:space="preserve">Brug kun poster oprettet til testen.</w:t>
-      </w:r>
-    </w:p>
-    <w:p>
-      <w:pPr>
-        <w:keepLines w:val="1"/>
-        <w:spacing w:after="0"/>
-        <w:rPr/>
-      </w:pPr>
-      <w:r>
-        <w:rPr>
-          <w:rtl w:val="0"/>
-        </w:rPr>
-        <w:t xml:space="preserve">Hver person vurderer lærbarhed, effektivitet, fejl, hukommelse og tilfredshed.</w:t>
-      </w:r>
-    </w:p>
-    <w:p>
-      <w:pPr>
-        <w:keepLines w:val="1"/>
-        <w:spacing w:after="0"/>
-        <w:rPr/>
-      </w:pPr>
-      <w:r>
-        <w:rPr>
-          <w:rtl w:val="0"/>
-        </w:rPr>
-        <w:t xml:space="preserve">Klassekammerater er praktiske til opgaven, men kan have mere teknisk erfaring end målgruppen.</w:t>
-      </w:r>
-    </w:p>
-    <w:p>
-      <w:pPr>
-        <w:keepLines w:val="1"/>
-        <w:rPr/>
-      </w:pPr>
-      <w:r>
-        <w:rPr>
-          <w:rtl w:val="0"/>
-        </w:rPr>
-        <w:t xml:space="preserve">En høj vurdering i klassen fortæller derfor ikke alene, hvordan alle almindelige brugere vil opleve løsningen.</w:t>
+        <w:spacing w:after="0" w:lineRule="auto"/>
+        <w:rPr/>
+      </w:pPr>
+      <w:r>
+        <w:rPr>
+          <w:rtl w:val="0"/>
+        </w:rPr>
+        <w:t xml:space="preserve">Ved hentning af projektet.</w:t>
       </w:r>
     </w:p>
     <w:p>
@@ -2843,7 +2620,7 @@
     <w:p>
       <w:pPr>
         <w:keepLines w:val="1"/>
-        <w:spacing w:after="0"/>
+        <w:spacing w:after="0" w:lineRule="auto"/>
         <w:rPr/>
       </w:pPr>
       <w:r>
@@ -2856,13 +2633,13 @@
     <w:p>
       <w:pPr>
         <w:keepLines w:val="1"/>
-        <w:rPr/>
-      </w:pPr>
-      <w:r>
-        <w:rPr>
-          <w:rtl w:val="0"/>
-        </w:rPr>
-        <w:t xml:space="preserve">Testpersonernes oplyste samlede resultat står nederst.</w:t>
+        <w:spacing w:after="0" w:lineRule="auto"/>
+        <w:rPr/>
+      </w:pPr>
+      <w:r>
+        <w:rPr>
+          <w:rtl w:val="0"/>
+        </w:rPr>
       </w:r>
     </w:p>
     <w:p>
@@ -2878,6 +2655,47 @@
       </w:pPr>
       <w:r>
         <w:rPr>
+          <w:b w:val="1"/>
+          <w:bCs w:val="1"/>
+          <w:sz w:val="23"/>
+          <w:szCs w:val="23"/>
+          <w:rtl w:val="0"/>
+        </w:rPr>
+        <w:t xml:space="preserve">Lærbarhed - Kan en ny bruger hurtigt forstå systemet?</w:t>
+      </w:r>
+    </w:p>
+    <w:p>
+      <w:pPr>
+        <w:keepLines w:val="1"/>
+        <w:spacing w:after="0" w:lineRule="auto"/>
+        <w:rPr/>
+      </w:pPr>
+      <w:r>
+        <w:rPr>
+          <w:rtl w:val="0"/>
+        </w:rPr>
+        <w:t xml:space="preserve">Visuelt simpelt. Ny post og den fælles formular giver et ensartet forløb.</w:t>
+      </w:r>
+    </w:p>
+    <w:p>
+      <w:pPr>
+        <w:keepLines w:val="1"/>
+        <w:spacing w:after="0" w:lineRule="auto"/>
+        <w:rPr>
+          <w:b w:val="1"/>
+          <w:bCs w:val="1"/>
+          <w:sz w:val="23"/>
+          <w:szCs w:val="23"/>
+        </w:rPr>
+      </w:pPr>
+      <w:r>
+        <w:rPr>
+          <w:rtl w:val="0"/>
+        </w:rPr>
+        <w:t xml:space="preserve">Blyanten for redigerings symbol, med en forklarende tekst ved musemarkering.</w:t>
+      </w:r>
+      <w:r>
+        <w:rPr>
           <w:rtl w:val="0"/>
         </w:rPr>
       </w:r>
@@ -2901,45 +2719,55 @@
           <w:szCs w:val="23"/>
           <w:rtl w:val="0"/>
         </w:rPr>
-        <w:t xml:space="preserve">Lærbarhed - Kan en ny bruger hurtigt forstå systemet?</w:t>
-      </w:r>
-    </w:p>
-    <w:p>
-      <w:pPr>
-        <w:keepLines w:val="1"/>
-        <w:spacing w:after="0"/>
-        <w:rPr/>
-      </w:pPr>
-      <w:r>
-        <w:rPr>
-          <w:rtl w:val="0"/>
-        </w:rPr>
-        <w:t xml:space="preserve">Ny post og den fælles formular giver et ensartet forløb.</w:t>
-      </w:r>
-    </w:p>
-    <w:p>
-      <w:pPr>
-        <w:keepLines w:val="1"/>
-        <w:spacing w:after="0"/>
-        <w:rPr/>
-      </w:pPr>
-      <w:r>
-        <w:rPr>
-          <w:rtl w:val="0"/>
-        </w:rPr>
-        <w:t xml:space="preserve">Blyanten har en forklarende tekst ved musemarkering.</w:t>
-      </w:r>
-    </w:p>
-    <w:p>
-      <w:pPr>
-        <w:keepLines w:val="1"/>
-        <w:rPr/>
-      </w:pPr>
-      <w:r>
-        <w:rPr>
-          <w:rtl w:val="0"/>
-        </w:rPr>
-        <w:t xml:space="preserve">Engelske tabelnavne og felter med fremmednøgle-ID’er kan stadig kræve en introduktion.</w:t>
+        <w:t xml:space="preserve">Effektivitet - Kan brugeren løse opgaven hurtigt?</w:t>
+      </w:r>
+    </w:p>
+    <w:p>
+      <w:pPr>
+        <w:keepLines w:val="1"/>
+        <w:spacing w:after="0" w:lineRule="auto"/>
+        <w:rPr/>
+      </w:pPr>
+      <w:r>
+        <w:rPr>
+          <w:rtl w:val="0"/>
+        </w:rPr>
+        <w:t xml:space="preserve">Ja. Opret og rediger kræver få klik, og brugeren bliver på samme side.</w:t>
+      </w:r>
+    </w:p>
+    <w:p>
+      <w:pPr>
+        <w:keepLines w:val="1"/>
+        <w:spacing w:after="0" w:lineRule="auto"/>
+        <w:rPr/>
+      </w:pPr>
+      <w:r>
+        <w:rPr>
+          <w:rtl w:val="0"/>
+        </w:rPr>
+        <w:t xml:space="preserve">Sideinddelingen begrænser visningen til 100 rækker ad gangen.</w:t>
+      </w:r>
+    </w:p>
+    <w:p>
+      <w:pPr>
+        <w:keepLines w:val="1"/>
+        <w:rPr>
+          <w:b w:val="1"/>
+          <w:bCs w:val="1"/>
+          <w:sz w:val="23"/>
+          <w:szCs w:val="23"/>
+        </w:rPr>
+      </w:pPr>
+      <w:r>
+        <w:rPr>
+          <w:rtl w:val="0"/>
+        </w:rPr>
+        <w:t xml:space="preserve">At finde en bestemt post i en stor tabel kan dog tage tid, fordi der ikke er en søgefunktion.</w:t>
+      </w:r>
+      <w:r>
+        <w:rPr>
+          <w:rtl w:val="0"/>
+        </w:rPr>
       </w:r>
     </w:p>
     <w:p>
@@ -2955,6 +2783,59 @@
       </w:pPr>
       <w:r>
         <w:rPr>
+          <w:b w:val="1"/>
+          <w:bCs w:val="1"/>
+          <w:sz w:val="23"/>
+          <w:szCs w:val="23"/>
+          <w:rtl w:val="0"/>
+        </w:rPr>
+        <w:t xml:space="preserve">Fejl - Hvor ofte laver brugeren fejl?</w:t>
+      </w:r>
+    </w:p>
+    <w:p>
+      <w:pPr>
+        <w:keepLines w:val="1"/>
+        <w:spacing w:after="0" w:lineRule="auto"/>
+        <w:rPr/>
+      </w:pPr>
+      <w:r>
+        <w:rPr>
+          <w:rtl w:val="0"/>
+        </w:rPr>
+        <w:t xml:space="preserve">Der var ikke nogen oplyste, oplevede fejl.</w:t>
+      </w:r>
+    </w:p>
+    <w:p>
+      <w:pPr>
+        <w:keepLines w:val="1"/>
+        <w:spacing w:after="0" w:lineRule="auto"/>
+        <w:rPr/>
+      </w:pPr>
+      <w:r>
+        <w:rPr>
+          <w:rtl w:val="0"/>
+        </w:rPr>
+        <w:t xml:space="preserve">Låste ID’er, obligatoriske felter og bekræftelse før sletning hjælper med at forebygge fejl.</w:t>
+      </w:r>
+    </w:p>
+    <w:p>
+      <w:pPr>
+        <w:keepLines w:val="1"/>
+        <w:rPr>
+          <w:b w:val="1"/>
+          <w:bCs w:val="1"/>
+          <w:sz w:val="23"/>
+          <w:szCs w:val="23"/>
+        </w:rPr>
+      </w:pPr>
+      <w:r>
+        <w:rPr>
+          <w:rtl w:val="0"/>
+        </w:rPr>
+        <w:t xml:space="preserve">Indtastning af fremmednøgle-ID’er kan stadig føre til afviste ændringer.</w:t>
+      </w:r>
+      <w:r>
+        <w:rPr>
           <w:rtl w:val="0"/>
         </w:rPr>
       </w:r>
@@ -2978,45 +2859,30 @@
           <w:szCs w:val="23"/>
           <w:rtl w:val="0"/>
         </w:rPr>
-        <w:t xml:space="preserve">Effektivitet - Kan brugeren løse opgaven hurtigt?</w:t>
-      </w:r>
-    </w:p>
-    <w:p>
-      <w:pPr>
-        <w:keepLines w:val="1"/>
-        <w:spacing w:after="0"/>
-        <w:rPr/>
-      </w:pPr>
-      <w:r>
-        <w:rPr>
-          <w:rtl w:val="0"/>
-        </w:rPr>
-        <w:t xml:space="preserve">Opret og rediger kræver få klik, og brugeren bliver på samme side.</w:t>
-      </w:r>
-    </w:p>
-    <w:p>
-      <w:pPr>
-        <w:keepLines w:val="1"/>
-        <w:spacing w:after="0"/>
-        <w:rPr/>
-      </w:pPr>
-      <w:r>
-        <w:rPr>
-          <w:rtl w:val="0"/>
-        </w:rPr>
-        <w:t xml:space="preserve">Sideinddelingen begrænser visningen til 100 rækker ad gangen.</w:t>
-      </w:r>
-    </w:p>
-    <w:p>
-      <w:pPr>
-        <w:keepLines w:val="1"/>
-        <w:rPr/>
-      </w:pPr>
-      <w:r>
-        <w:rPr>
-          <w:rtl w:val="0"/>
-        </w:rPr>
-        <w:t xml:space="preserve">At finde en bestemt post i en stor tabel kan dog tage tid, fordi der ikke er en søgefunktion.</w:t>
+        <w:t xml:space="preserve">Hukommelse - Kan brugeren finde ud af systemet igen efter en pause?</w:t>
+      </w:r>
+    </w:p>
+    <w:p>
+      <w:pPr>
+        <w:keepLines w:val="1"/>
+        <w:spacing w:after="0" w:lineRule="auto"/>
+        <w:rPr>
+          <w:b w:val="1"/>
+          <w:bCs w:val="1"/>
+          <w:sz w:val="23"/>
+          <w:szCs w:val="23"/>
+        </w:rPr>
+      </w:pPr>
+      <w:r>
+        <w:rPr>
+          <w:rtl w:val="0"/>
+        </w:rPr>
+        <w:t xml:space="preserve">De samme knapper og den samme formular bruges på tværs af tabeller, hvilket kan gøre arbejdsgangen lettere at huske.</w:t>
+      </w:r>
+      <w:r>
+        <w:rPr>
+          <w:rtl w:val="0"/>
+        </w:rPr>
       </w:r>
     </w:p>
     <w:p>
@@ -3032,6 +2898,59 @@
       </w:pPr>
       <w:r>
         <w:rPr>
+          <w:b w:val="1"/>
+          <w:bCs w:val="1"/>
+          <w:sz w:val="23"/>
+          <w:szCs w:val="23"/>
+          <w:rtl w:val="0"/>
+        </w:rPr>
+        <w:t xml:space="preserve">Tilfredshed - Føles systemet logisk og behageligt at bruge?</w:t>
+      </w:r>
+    </w:p>
+    <w:p>
+      <w:pPr>
+        <w:keepLines w:val="1"/>
+        <w:spacing w:after="0" w:lineRule="auto"/>
+        <w:rPr/>
+      </w:pPr>
+      <w:r>
+        <w:rPr>
+          <w:rtl w:val="0"/>
+        </w:rPr>
+        <w:t xml:space="preserve">Den fælles formular, Annuller og beskeden om gemte ændringer giver et tydeligt forløb.</w:t>
+      </w:r>
+    </w:p>
+    <w:p>
+      <w:pPr>
+        <w:keepLines w:val="1"/>
+        <w:spacing w:after="0" w:lineRule="auto"/>
+        <w:rPr/>
+      </w:pPr>
+      <w:r>
+        <w:rPr>
+          <w:rtl w:val="0"/>
+        </w:rPr>
+        <w:t xml:space="preserve">Det samlede resultat på 4,5 tyder på en positiv oplevelse.</w:t>
+      </w:r>
+    </w:p>
+    <w:p>
+      <w:pPr>
+        <w:keepLines w:val="1"/>
+        <w:rPr>
+          <w:b w:val="1"/>
+          <w:bCs w:val="1"/>
+          <w:sz w:val="23"/>
+          <w:szCs w:val="23"/>
+        </w:rPr>
+      </w:pPr>
+      <w:r>
+        <w:rPr>
+          <w:rtl w:val="0"/>
+        </w:rPr>
+        <w:t xml:space="preserve">Der er ikke oplyst en særskilt karakter for tilfredshed eller konkrete kommentarer.</w:t>
+      </w:r>
+      <w:r>
+        <w:rPr>
           <w:rtl w:val="0"/>
         </w:rPr>
       </w:r>
@@ -3055,224 +2974,6 @@
           <w:szCs w:val="23"/>
           <w:rtl w:val="0"/>
         </w:rPr>
-        <w:t xml:space="preserve">Fejl - Hvor ofte laver brugeren fejl?</w:t>
-      </w:r>
-    </w:p>
-    <w:p>
-      <w:pPr>
-        <w:keepLines w:val="1"/>
-        <w:spacing w:after="0"/>
-        <w:rPr/>
-      </w:pPr>
-      <w:r>
-        <w:rPr>
-          <w:rtl w:val="0"/>
-        </w:rPr>
-        <w:t xml:space="preserve">Der er ikke oplyst et målt antal fejl.</w:t>
-      </w:r>
-    </w:p>
-    <w:p>
-      <w:pPr>
-        <w:keepLines w:val="1"/>
-        <w:spacing w:after="0"/>
-        <w:rPr/>
-      </w:pPr>
-      <w:r>
-        <w:rPr>
-          <w:rtl w:val="0"/>
-        </w:rPr>
-        <w:t xml:space="preserve">Låste ID’er, obligatoriske felter og bekræftelse før sletning hjælper med at forebygge fejl.</w:t>
-      </w:r>
-    </w:p>
-    <w:p>
-      <w:pPr>
-        <w:keepLines w:val="1"/>
-        <w:rPr/>
-      </w:pPr>
-      <w:r>
-        <w:rPr>
-          <w:rtl w:val="0"/>
-        </w:rPr>
-        <w:t xml:space="preserve">Indtastning af fremmednøgle-ID’er kan stadig føre til afviste ændringer.</w:t>
-      </w:r>
-    </w:p>
-    <w:p>
-      <w:pPr>
-        <w:pStyle w:val="Heading2"/>
-        <w:spacing w:after="60" w:before="160" w:lineRule="auto"/>
-        <w:rPr>
-          <w:b w:val="1"/>
-          <w:bCs w:val="1"/>
-          <w:sz w:val="23"/>
-          <w:szCs w:val="23"/>
-        </w:rPr>
-      </w:pPr>
-      <w:r>
-        <w:rPr>
-          <w:rtl w:val="0"/>
-        </w:rPr>
-      </w:r>
-    </w:p>
-    <w:p>
-      <w:pPr>
-        <w:pStyle w:val="Heading2"/>
-        <w:spacing w:after="60" w:before="160" w:lineRule="auto"/>
-        <w:rPr>
-          <w:b w:val="1"/>
-          <w:bCs w:val="1"/>
-          <w:sz w:val="23"/>
-          <w:szCs w:val="23"/>
-        </w:rPr>
-      </w:pPr>
-      <w:r>
-        <w:rPr>
-          <w:b w:val="1"/>
-          <w:bCs w:val="1"/>
-          <w:sz w:val="23"/>
-          <w:szCs w:val="23"/>
-          <w:rtl w:val="0"/>
-        </w:rPr>
-        <w:t xml:space="preserve">Hukommelse - Kan brugeren finde ud af systemet igen efter en pause?</w:t>
-      </w:r>
-    </w:p>
-    <w:p>
-      <w:pPr>
-        <w:keepLines w:val="1"/>
-        <w:spacing w:after="0"/>
-        <w:rPr/>
-      </w:pPr>
-      <w:r>
-        <w:rPr>
-          <w:rtl w:val="0"/>
-        </w:rPr>
-        <w:t xml:space="preserve">De samme knapper og den samme formular bruges på tværs af tabeller, hvilket kan gøre arbejdsgangen lettere at huske.</w:t>
-      </w:r>
-    </w:p>
-    <w:p>
-      <w:pPr>
-        <w:keepLines w:val="1"/>
-        <w:rPr/>
-      </w:pPr>
-      <w:r>
-        <w:rPr>
-          <w:rtl w:val="0"/>
-        </w:rPr>
-        <w:t xml:space="preserve">Det bør undersøges ved at lade testpersonen gentage en handling efter en pause uden hjælp.</w:t>
-      </w:r>
-    </w:p>
-    <w:p>
-      <w:pPr>
-        <w:pStyle w:val="Heading2"/>
-        <w:spacing w:after="60" w:before="160" w:lineRule="auto"/>
-        <w:rPr>
-          <w:b w:val="1"/>
-          <w:bCs w:val="1"/>
-          <w:sz w:val="23"/>
-          <w:szCs w:val="23"/>
-        </w:rPr>
-      </w:pPr>
-      <w:r>
-        <w:rPr>
-          <w:rtl w:val="0"/>
-        </w:rPr>
-      </w:r>
-    </w:p>
-    <w:p>
-      <w:pPr>
-        <w:pStyle w:val="Heading2"/>
-        <w:spacing w:after="60" w:before="160" w:lineRule="auto"/>
-        <w:rPr>
-          <w:b w:val="1"/>
-          <w:bCs w:val="1"/>
-          <w:sz w:val="23"/>
-          <w:szCs w:val="23"/>
-        </w:rPr>
-      </w:pPr>
-      <w:r>
-        <w:rPr>
-          <w:b w:val="1"/>
-          <w:bCs w:val="1"/>
-          <w:sz w:val="23"/>
-          <w:szCs w:val="23"/>
-          <w:rtl w:val="0"/>
-        </w:rPr>
-        <w:t xml:space="preserve">Tilfredshed - Føles systemet logisk og behageligt at bruge?</w:t>
-      </w:r>
-    </w:p>
-    <w:p>
-      <w:pPr>
-        <w:keepLines w:val="1"/>
-        <w:spacing w:after="0"/>
-        <w:rPr/>
-      </w:pPr>
-      <w:r>
-        <w:rPr>
-          <w:rtl w:val="0"/>
-        </w:rPr>
-        <w:t xml:space="preserve">Den fælles formular, Annuller og beskeden om gemte ændringer giver et tydeligt forløb.</w:t>
-      </w:r>
-    </w:p>
-    <w:p>
-      <w:pPr>
-        <w:keepLines w:val="1"/>
-        <w:spacing w:after="0"/>
-        <w:rPr/>
-      </w:pPr>
-      <w:r>
-        <w:rPr>
-          <w:rtl w:val="0"/>
-        </w:rPr>
-        <w:t xml:space="preserve">Det samlede resultat på 4,5 tyder på en positiv oplevelse.</w:t>
-      </w:r>
-    </w:p>
-    <w:p>
-      <w:pPr>
-        <w:keepLines w:val="1"/>
-        <w:rPr/>
-      </w:pPr>
-      <w:r>
-        <w:rPr>
-          <w:rtl w:val="0"/>
-        </w:rPr>
-        <w:t xml:space="preserve">Der er ikke oplyst en særskilt karakter for tilfredshed eller konkrete kommentarer.</w:t>
-      </w:r>
-    </w:p>
-    <w:p>
-      <w:pPr>
-        <w:pStyle w:val="Heading2"/>
-        <w:spacing w:after="60" w:before="160" w:lineRule="auto"/>
-        <w:rPr>
-          <w:b w:val="1"/>
-          <w:bCs w:val="1"/>
-          <w:sz w:val="23"/>
-          <w:szCs w:val="23"/>
-        </w:rPr>
-      </w:pPr>
-      <w:r>
-        <w:rPr>
-          <w:rtl w:val="0"/>
-        </w:rPr>
-      </w:r>
-    </w:p>
-    <w:p>
-      <w:pPr>
-        <w:pStyle w:val="Heading2"/>
-        <w:spacing w:after="60" w:before="160" w:lineRule="auto"/>
-        <w:rPr>
-          <w:b w:val="1"/>
-          <w:bCs w:val="1"/>
-          <w:sz w:val="23"/>
-          <w:szCs w:val="23"/>
-        </w:rPr>
-      </w:pPr>
-      <w:r>
-        <w:rPr>
-          <w:b w:val="1"/>
-          <w:bCs w:val="1"/>
-          <w:sz w:val="23"/>
-          <w:szCs w:val="23"/>
-          <w:rtl w:val="0"/>
-        </w:rPr>
         <w:t xml:space="preserve">Samlet resultat og refleksion</w:t>
       </w:r>
     </w:p>
@@ -3306,112 +3007,32 @@
           <w:bCs w:val="1"/>
           <w:rtl w:val="0"/>
         </w:rPr>
-        <w:t xml:space="preserve">Testpersonernes oplyste gennemsnit: 4,5 ud af 5. Højere er bedre.</w:t>
-      </w:r>
-    </w:p>
-    <w:p>
-      <w:pPr>
-        <w:keepLines w:val="1"/>
-        <w:spacing w:after="0"/>
-        <w:rPr/>
-      </w:pPr>
-      <w:r>
-        <w:rPr>
-          <w:rtl w:val="0"/>
-        </w:rPr>
-        <w:t xml:space="preserve">Vi bruger 1 = dårligt og 5 = godt; for fejl betyder en høj karakter, at der er få problemer med fejl.</w:t>
-      </w:r>
-    </w:p>
-    <w:p>
-      <w:pPr>
-        <w:keepLines w:val="1"/>
-        <w:spacing w:after="0"/>
-        <w:rPr/>
-      </w:pPr>
-      <w:r>
-        <w:rPr>
-          <w:rtl w:val="0"/>
-        </w:rPr>
-        <w:t xml:space="preserve">Resultatet ligger over 3 og peger på en overordnet positiv vurdering af CRUD-designet.</w:t>
-      </w:r>
-    </w:p>
-    <w:p>
-      <w:pPr>
-        <w:keepLines w:val="1"/>
-        <w:rPr/>
-      </w:pPr>
-      <w:r>
-        <w:rPr>
-          <w:rtl w:val="0"/>
-        </w:rPr>
-        <w:t xml:space="preserve">Det viser ikke i sig selv, hvilket af de fem områder der fungerer bedst.</w:t>
-      </w:r>
-    </w:p>
-    <w:p>
-      <w:pPr>
-        <w:keepLines w:val="1"/>
-        <w:spacing w:after="0"/>
-        <w:rPr/>
-      </w:pPr>
-      <w:r>
-        <w:rPr>
-          <w:rtl w:val="0"/>
-        </w:rPr>
-        <w:t xml:space="preserve">Kun det samlede gennemsnit er oplyst.</w:t>
-      </w:r>
-    </w:p>
-    <w:p>
-      <w:pPr>
-        <w:keepLines w:val="1"/>
-        <w:spacing w:after="0"/>
-        <w:rPr/>
-      </w:pPr>
-      <w:r>
-        <w:rPr>
-          <w:rtl w:val="0"/>
-        </w:rPr>
-        <w:t xml:space="preserve">Der er derfor ikke indsat individuelle karakterer, målte tider eller et målt antal fejl.</w:t>
-      </w:r>
-    </w:p>
-    <w:p>
-      <w:pPr>
-        <w:keepLines w:val="1"/>
-        <w:rPr/>
-      </w:pPr>
-      <w:r>
-        <w:rPr>
-          <w:rtl w:val="0"/>
-        </w:rPr>
-        <w:t xml:space="preserve">Gennemsnittet er gengivet og ikke genberegnet ud fra enkeltsvar.</w:t>
-      </w:r>
-    </w:p>
-    <w:p>
-      <w:pPr>
-        <w:keepLines w:val="1"/>
-        <w:rPr/>
-      </w:pPr>
-      <w:r>
-        <w:rPr>
-          <w:rtl w:val="0"/>
-        </w:rPr>
-      </w:r>
-    </w:p>
-    <w:p>
-      <w:pPr>
-        <w:keepLines w:val="1"/>
-        <w:shd w:fill="f2f2f2" w:val="clear"/>
-        <w:rPr>
-          <w:sz w:val="20"/>
-          <w:szCs w:val="20"/>
-        </w:rPr>
-      </w:pPr>
-      <w:r>
-        <w:rPr>
-          <w:sz w:val="20"/>
-          <w:szCs w:val="20"/>
-          <w:rtl w:val="0"/>
-        </w:rPr>
-        <w:t xml:space="preserve">Valg af skala: PDF’ens tabel siger 1 = godt og 5 = dårligt, mens teksten fremhæver et gennemsnit over 3. Her følger vi den aftalte fortolkning, hvor 5 er bedst.</w:t>
+        <w:t xml:space="preserve">Testpersonernes oplyste gennemsnit: 4,5 ud af 5. </w:t>
+      </w:r>
+    </w:p>
+    <w:p>
+      <w:pPr>
+        <w:keepLines w:val="1"/>
+        <w:spacing w:after="0" w:lineRule="auto"/>
+        <w:rPr/>
+      </w:pPr>
+      <w:r>
+        <w:rPr>
+          <w:rtl w:val="0"/>
+        </w:rPr>
+        <w:t xml:space="preserve">Jeg antager at 1 = dårligt og 5 = godt.</w:t>
+      </w:r>
+    </w:p>
+    <w:p>
+      <w:pPr>
+        <w:keepLines w:val="1"/>
+        <w:spacing w:after="0" w:lineRule="auto"/>
+        <w:rPr/>
+      </w:pPr>
+      <w:r>
+        <w:rPr>
+          <w:rtl w:val="0"/>
+        </w:rPr>
       </w:r>
     </w:p>
     <w:sectPr>
@@ -3542,6 +3163,20 @@
     <w:next w:val="Normal"/>
     <w:pPr/>
     <w:rPr/>
+  </w:style>
+  <w:style w:type="table" w:styleId="TableNormal" w:default="1">
+    <w:name w:val="TableNormal"/>
+    <w:tblPr>
+      <w:tblCellMar>
+        <w:top w:w="100.0" w:type="dxa"/>
+        <w:left w:w="100.0" w:type="dxa"/>
+        <w:bottom w:w="100.0" w:type="dxa"/>
+        <w:right w:w="100.0" w:type="dxa"/>
+      </w:tblCellMar>
+    </w:tblPr>
+  </w:style>
+  <w:style w:type="paragraph" w:styleId="Normal" w:default="1">
+    <w:name w:val="normal"/>
   </w:style>
   <w:style w:type="paragraph" w:styleId="Heading7">
     <w:name w:val="heading 7"/>
@@ -4191,7 +3826,7 @@
 
 <file path=customXML/item1.xml><?xml version="1.0" encoding="utf-8"?>
 <go:gDocsCustomXmlDataStorage xmlns:go="http://customooxmlschemas.google.com/" xmlns:r="http://schemas.openxmlformats.org/officeDocument/2006/relationships" uri="GoogleDocsCustomDataVersion2">
-  <go:docsCustomData xmlns:go="http://customooxmlschemas.google.com/" roundtripDataSignature="AMtx7mgNeRIuUZCsEgfQJ7fq6YY6wWVWlg==">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</go:docsCustomData>
+  <go:docsCustomData xmlns:go="http://customooxmlschemas.google.com/" roundtripDataSignature="AMtx7mgcV0BuWEDdDALhaQA+d3RYRw0dkg==">CgMxLjAyDmguZWxpdWU2dXZtMTc5Mg5oLmFwa3Rib3ltcWFyYzIOaC52dmloNDFscmI3M3c4AHIhMWJlQVlMMEtXMVhlUGk5bC14bDNBcXpQeFBOSVZ3VTVH</go:docsCustomData>
 </go:gDocsCustomXmlDataStorage>
 </file>
 

</xml_diff>